<commit_message>
more notes and setup instructions added
</commit_message>
<xml_diff>
--- a/Setup Steps.docx
+++ b/Setup Steps.docx
@@ -65,7 +65,7 @@
           <w:r>
             <w:fldChar w:fldCharType="separate"/>
           </w:r>
-          <w:hyperlink w:anchor="_Toc227773856" w:history="1">
+          <w:hyperlink w:anchor="_Toc228192860" w:history="1">
             <w:r>
               <w:rPr>
                 <w:rStyle w:val="Hyperlink"/>
@@ -93,7 +93,7 @@
                 <w:noProof/>
                 <w:webHidden/>
               </w:rPr>
-              <w:instrText xml:space="preserve"> PAGEREF _Toc227773856 \h </w:instrText>
+              <w:instrText xml:space="preserve"> PAGEREF _Toc228192860 \h </w:instrText>
             </w:r>
             <w:r>
               <w:rPr>
@@ -140,7 +140,7 @@
               <w14:ligatures w14:val="standardContextual"/>
             </w:rPr>
           </w:pPr>
-          <w:hyperlink w:anchor="_Toc227773857" w:history="1">
+          <w:hyperlink w:anchor="_Toc228192861" w:history="1">
             <w:r>
               <w:rPr>
                 <w:rStyle w:val="Hyperlink"/>
@@ -168,7 +168,7 @@
                 <w:noProof/>
                 <w:webHidden/>
               </w:rPr>
-              <w:instrText xml:space="preserve"> PAGEREF _Toc227773857 \h </w:instrText>
+              <w:instrText xml:space="preserve"> PAGEREF _Toc228192861 \h </w:instrText>
             </w:r>
             <w:r>
               <w:rPr>
@@ -215,7 +215,7 @@
               <w14:ligatures w14:val="standardContextual"/>
             </w:rPr>
           </w:pPr>
-          <w:hyperlink w:anchor="_Toc227773858" w:history="1">
+          <w:hyperlink w:anchor="_Toc228192862" w:history="1">
             <w:r>
               <w:rPr>
                 <w:rStyle w:val="Hyperlink"/>
@@ -250,7 +250,7 @@
                 <w:noProof/>
                 <w:webHidden/>
               </w:rPr>
-              <w:instrText xml:space="preserve"> PAGEREF _Toc227773858 \h </w:instrText>
+              <w:instrText xml:space="preserve"> PAGEREF _Toc228192862 \h </w:instrText>
             </w:r>
             <w:r>
               <w:rPr>
@@ -297,7 +297,7 @@
               <w14:ligatures w14:val="standardContextual"/>
             </w:rPr>
           </w:pPr>
-          <w:hyperlink w:anchor="_Toc227773859" w:history="1">
+          <w:hyperlink w:anchor="_Toc228192863" w:history="1">
             <w:r>
               <w:rPr>
                 <w:rStyle w:val="Hyperlink"/>
@@ -332,7 +332,7 @@
                 <w:noProof/>
                 <w:webHidden/>
               </w:rPr>
-              <w:instrText xml:space="preserve"> PAGEREF _Toc227773859 \h </w:instrText>
+              <w:instrText xml:space="preserve"> PAGEREF _Toc228192863 \h </w:instrText>
             </w:r>
             <w:r>
               <w:rPr>
@@ -379,7 +379,7 @@
               <w14:ligatures w14:val="standardContextual"/>
             </w:rPr>
           </w:pPr>
-          <w:hyperlink w:anchor="_Toc227773860" w:history="1">
+          <w:hyperlink w:anchor="_Toc228192864" w:history="1">
             <w:r>
               <w:rPr>
                 <w:rStyle w:val="Hyperlink"/>
@@ -407,7 +407,7 @@
                 <w:noProof/>
                 <w:webHidden/>
               </w:rPr>
-              <w:instrText xml:space="preserve"> PAGEREF _Toc227773860 \h </w:instrText>
+              <w:instrText xml:space="preserve"> PAGEREF _Toc228192864 \h </w:instrText>
             </w:r>
             <w:r>
               <w:rPr>
@@ -454,14 +454,14 @@
               <w14:ligatures w14:val="standardContextual"/>
             </w:rPr>
           </w:pPr>
-          <w:hyperlink w:anchor="_Toc227773861" w:history="1">
+          <w:hyperlink w:anchor="_Toc228192865" w:history="1">
             <w:r>
               <w:rPr>
                 <w:rStyle w:val="Hyperlink"/>
                 <w:noProof/>
                 <w:lang w:val="en-US"/>
               </w:rPr>
-              <w:t>Setup Local Virtual Python Environment</w:t>
+              <w:t>Cloning the HOL Repositories</w:t>
             </w:r>
             <w:r>
               <w:rPr>
@@ -482,7 +482,7 @@
                 <w:noProof/>
                 <w:webHidden/>
               </w:rPr>
-              <w:instrText xml:space="preserve"> PAGEREF _Toc227773861 \h </w:instrText>
+              <w:instrText xml:space="preserve"> PAGEREF _Toc228192865 \h </w:instrText>
             </w:r>
             <w:r>
               <w:rPr>
@@ -529,7 +529,7 @@
               <w14:ligatures w14:val="standardContextual"/>
             </w:rPr>
           </w:pPr>
-          <w:hyperlink w:anchor="_Toc227773862" w:history="1">
+          <w:hyperlink w:anchor="_Toc228192866" w:history="1">
             <w:r>
               <w:rPr>
                 <w:rStyle w:val="Hyperlink"/>
@@ -557,7 +557,7 @@
                 <w:noProof/>
                 <w:webHidden/>
               </w:rPr>
-              <w:instrText xml:space="preserve"> PAGEREF _Toc227773862 \h </w:instrText>
+              <w:instrText xml:space="preserve"> PAGEREF _Toc228192866 \h </w:instrText>
             </w:r>
             <w:r>
               <w:rPr>
@@ -578,6 +578,172 @@
                 <w:webHidden/>
               </w:rPr>
               <w:t>3</w:t>
+            </w:r>
+            <w:r>
+              <w:rPr>
+                <w:noProof/>
+                <w:webHidden/>
+              </w:rPr>
+              <w:fldChar w:fldCharType="end"/>
+            </w:r>
+          </w:hyperlink>
+        </w:p>
+        <w:p>
+          <w:pPr>
+            <w:pStyle w:val="TOC1"/>
+            <w:tabs>
+              <w:tab w:val="right" w:leader="dot" w:pos="9016"/>
+            </w:tabs>
+            <w:rPr>
+              <w:rFonts w:eastAsiaTheme="minorEastAsia"/>
+              <w:noProof/>
+              <w:kern w:val="2"/>
+              <w:sz w:val="24"/>
+              <w:szCs w:val="24"/>
+              <w:lang w:eastAsia="en-IN"/>
+              <w14:ligatures w14:val="standardContextual"/>
+            </w:rPr>
+          </w:pPr>
+          <w:hyperlink w:anchor="_Toc228192867" w:history="1">
+            <w:r>
+              <w:rPr>
+                <w:rStyle w:val="Hyperlink"/>
+                <w:noProof/>
+                <w:lang w:val="en-US"/>
+              </w:rPr>
+              <w:t>Setup Local Virtual Python Environment</w:t>
+            </w:r>
+            <w:r>
+              <w:rPr>
+                <w:noProof/>
+                <w:webHidden/>
+              </w:rPr>
+              <w:tab/>
+            </w:r>
+            <w:r>
+              <w:rPr>
+                <w:noProof/>
+                <w:webHidden/>
+              </w:rPr>
+              <w:fldChar w:fldCharType="begin"/>
+            </w:r>
+            <w:r>
+              <w:rPr>
+                <w:noProof/>
+                <w:webHidden/>
+              </w:rPr>
+              <w:instrText xml:space="preserve"> PAGEREF _Toc228192867 \h </w:instrText>
+            </w:r>
+            <w:r>
+              <w:rPr>
+                <w:noProof/>
+                <w:webHidden/>
+              </w:rPr>
+            </w:r>
+            <w:r>
+              <w:rPr>
+                <w:noProof/>
+                <w:webHidden/>
+              </w:rPr>
+              <w:fldChar w:fldCharType="separate"/>
+            </w:r>
+            <w:r>
+              <w:rPr>
+                <w:noProof/>
+                <w:webHidden/>
+              </w:rPr>
+              <w:t>4</w:t>
+            </w:r>
+            <w:r>
+              <w:rPr>
+                <w:noProof/>
+                <w:webHidden/>
+              </w:rPr>
+              <w:fldChar w:fldCharType="end"/>
+            </w:r>
+          </w:hyperlink>
+        </w:p>
+        <w:p>
+          <w:pPr>
+            <w:pStyle w:val="TOC1"/>
+            <w:tabs>
+              <w:tab w:val="right" w:leader="dot" w:pos="9016"/>
+            </w:tabs>
+            <w:rPr>
+              <w:rFonts w:eastAsiaTheme="minorEastAsia"/>
+              <w:noProof/>
+              <w:kern w:val="2"/>
+              <w:sz w:val="24"/>
+              <w:szCs w:val="24"/>
+              <w:lang w:eastAsia="en-IN"/>
+              <w14:ligatures w14:val="standardContextual"/>
+            </w:rPr>
+          </w:pPr>
+          <w:hyperlink w:anchor="_Toc228192868" w:history="1">
+            <w:r>
+              <w:rPr>
+                <w:rStyle w:val="Hyperlink"/>
+                <w:noProof/>
+                <w:lang w:val="en-US"/>
+              </w:rPr>
+              <w:t>Running Python cod</w:t>
+            </w:r>
+            <w:r>
+              <w:rPr>
+                <w:rStyle w:val="Hyperlink"/>
+                <w:noProof/>
+                <w:lang w:val="en-US"/>
+              </w:rPr>
+              <w:t>e</w:t>
+            </w:r>
+            <w:r>
+              <w:rPr>
+                <w:rStyle w:val="Hyperlink"/>
+                <w:noProof/>
+                <w:lang w:val="en-US"/>
+              </w:rPr>
+              <w:t xml:space="preserve"> files</w:t>
+            </w:r>
+            <w:r>
+              <w:rPr>
+                <w:noProof/>
+                <w:webHidden/>
+              </w:rPr>
+              <w:tab/>
+            </w:r>
+            <w:r>
+              <w:rPr>
+                <w:noProof/>
+                <w:webHidden/>
+              </w:rPr>
+              <w:fldChar w:fldCharType="begin"/>
+            </w:r>
+            <w:r>
+              <w:rPr>
+                <w:noProof/>
+                <w:webHidden/>
+              </w:rPr>
+              <w:instrText xml:space="preserve"> PAGEREF _Toc228192868 \h </w:instrText>
+            </w:r>
+            <w:r>
+              <w:rPr>
+                <w:noProof/>
+                <w:webHidden/>
+              </w:rPr>
+            </w:r>
+            <w:r>
+              <w:rPr>
+                <w:noProof/>
+                <w:webHidden/>
+              </w:rPr>
+              <w:fldChar w:fldCharType="separate"/>
+            </w:r>
+            <w:r>
+              <w:rPr>
+                <w:noProof/>
+                <w:webHidden/>
+              </w:rPr>
+              <w:t>5</w:t>
             </w:r>
             <w:r>
               <w:rPr>
@@ -614,7 +780,7 @@
           <w:lang w:val="en-US"/>
         </w:rPr>
       </w:pPr>
-      <w:bookmarkStart w:id="0" w:name="_Toc227773856"/>
+      <w:bookmarkStart w:id="0" w:name="_Toc228192860"/>
       <w:r>
         <w:rPr>
           <w:lang w:val="en-US"/>
@@ -628,7 +794,7 @@
       <w:pPr>
         <w:pStyle w:val="Heading2"/>
       </w:pPr>
-      <w:bookmarkStart w:id="1" w:name="_Toc227773857"/>
+      <w:bookmarkStart w:id="1" w:name="_Toc228192861"/>
       <w:r>
         <w:rPr>
           <w:lang w:val="en-US"/>
@@ -731,7 +897,7 @@
       <w:pPr>
         <w:pStyle w:val="Heading2"/>
       </w:pPr>
-      <w:bookmarkStart w:id="2" w:name="_Toc227773858"/>
+      <w:bookmarkStart w:id="2" w:name="_Toc228192862"/>
       <w:r>
         <w:rPr>
           <w:lang w:val="en-US"/>
@@ -874,20 +1040,18 @@
           <w:lang w:val="en-US"/>
         </w:rPr>
       </w:pPr>
-      <w:proofErr w:type="gramStart"/>
       <w:r>
         <w:rPr>
           <w:lang w:val="en-US"/>
         </w:rPr>
         <w:t>Deploy</w:t>
       </w:r>
-      <w:proofErr w:type="gramEnd"/>
     </w:p>
     <w:p>
       <w:pPr>
         <w:pStyle w:val="Heading2"/>
       </w:pPr>
-      <w:bookmarkStart w:id="3" w:name="_Toc227773859"/>
+      <w:bookmarkStart w:id="3" w:name="_Toc228192863"/>
       <w:r>
         <w:rPr>
           <w:lang w:val="en-US"/>
@@ -979,14 +1143,12 @@
           <w:lang w:val="en-US"/>
         </w:rPr>
       </w:pPr>
-      <w:proofErr w:type="gramStart"/>
       <w:r>
         <w:rPr>
           <w:lang w:val="en-US"/>
         </w:rPr>
         <w:t>Deploy</w:t>
       </w:r>
-      <w:proofErr w:type="gramEnd"/>
     </w:p>
     <w:p>
       <w:pPr>
@@ -995,7 +1157,7 @@
           <w:lang w:val="en-US"/>
         </w:rPr>
       </w:pPr>
-      <w:bookmarkStart w:id="4" w:name="_Toc227773860"/>
+      <w:bookmarkStart w:id="4" w:name="_Toc228192864"/>
       <w:r>
         <w:rPr>
           <w:lang w:val="en-US"/>
@@ -1159,34 +1321,117 @@
     </w:p>
     <w:p>
       <w:pPr>
-        <w:rPr>
-          <w:lang w:val="en-US"/>
-        </w:rPr>
-      </w:pPr>
-    </w:p>
-    <w:p>
-      <w:pPr>
         <w:pStyle w:val="Heading1"/>
         <w:rPr>
           <w:lang w:val="en-US"/>
         </w:rPr>
       </w:pPr>
-      <w:bookmarkStart w:id="5" w:name="_Toc227773861"/>
+      <w:bookmarkStart w:id="5" w:name="_Toc228192865"/>
       <w:r>
         <w:rPr>
           <w:lang w:val="en-US"/>
         </w:rPr>
         <w:lastRenderedPageBreak/>
-        <w:t>Setup Local Virtual Python Environment</w:t>
+        <w:t>Cloning the HOL Repositories</w:t>
       </w:r>
       <w:bookmarkEnd w:id="5"/>
+    </w:p>
+    <w:p>
+      <w:pPr>
+        <w:rPr>
+          <w:lang w:val="en-US"/>
+        </w:rPr>
+      </w:pPr>
+      <w:r>
+        <w:rPr>
+          <w:lang w:val="en-US"/>
+        </w:rPr>
+        <w:t>The hands-on lab (</w:t>
+      </w:r>
+      <w:r>
+        <w:rPr>
+          <w:i/>
+          <w:iCs/>
+          <w:lang w:val="en-US"/>
+        </w:rPr>
+        <w:t>HOL</w:t>
+      </w:r>
+      <w:r>
+        <w:rPr>
+          <w:lang w:val="en-US"/>
+        </w:rPr>
+        <w:t>) exercises will be provided in separate URLs for each day.</w:t>
+      </w:r>
+    </w:p>
+    <w:p>
+      <w:pPr>
+        <w:rPr>
+          <w:lang w:val="en-US"/>
+        </w:rPr>
+      </w:pPr>
+      <w:r>
+        <w:rPr>
+          <w:lang w:val="en-US"/>
+        </w:rPr>
+        <w:t xml:space="preserve">For e.g.; for Day 1, the url is: </w:t>
+      </w:r>
+      <w:hyperlink r:id="rId8" w:history="1">
+        <w:r>
+          <w:rPr>
+            <w:rStyle w:val="Hyperlink"/>
+            <w:lang w:val="en-US"/>
+          </w:rPr>
+          <w:t>https://github.com/AjaySingala/ajs_hx_day01_april2026.git</w:t>
+        </w:r>
+      </w:hyperlink>
+    </w:p>
+    <w:p>
+      <w:pPr>
+        <w:rPr>
+          <w:lang w:val="en-US"/>
+        </w:rPr>
+      </w:pPr>
+      <w:r>
+        <w:rPr>
+          <w:lang w:val="en-US"/>
+        </w:rPr>
+        <w:t>Here are the steps to clone the repository (</w:t>
+      </w:r>
+      <w:r>
+        <w:rPr>
+          <w:i/>
+          <w:iCs/>
+          <w:lang w:val="en-US"/>
+        </w:rPr>
+        <w:t>repo</w:t>
+      </w:r>
+      <w:r>
+        <w:rPr>
+          <w:lang w:val="en-US"/>
+        </w:rPr>
+        <w:t>) on the VM (</w:t>
+      </w:r>
+      <w:r>
+        <w:rPr>
+          <w:i/>
+          <w:iCs/>
+          <w:lang w:val="en-US"/>
+        </w:rPr>
+        <w:t>or your local machine</w:t>
+      </w:r>
+      <w:r>
+        <w:rPr>
+          <w:lang w:val="en-US"/>
+        </w:rPr>
+        <w:t>) and use it:</w:t>
+      </w:r>
     </w:p>
     <w:p>
       <w:pPr>
         <w:pStyle w:val="ListParagraph"/>
         <w:numPr>
           <w:ilvl w:val="0"/>
-          <w:numId w:val="11"/>
+          <w:numId w:val="12"/>
         </w:numPr>
         <w:rPr>
           <w:lang w:val="en-US"/>
@@ -1196,7 +1441,7 @@
         <w:rPr>
           <w:lang w:val="en-US"/>
         </w:rPr>
-        <w:t>Open your project’s folder in VS Code (VSC).</w:t>
+        <w:t>On the VM, open the terminal emulator.</w:t>
       </w:r>
     </w:p>
     <w:p>
@@ -1204,7 +1449,7 @@
         <w:pStyle w:val="ListParagraph"/>
         <w:numPr>
           <w:ilvl w:val="0"/>
-          <w:numId w:val="11"/>
+          <w:numId w:val="12"/>
         </w:numPr>
         <w:rPr>
           <w:lang w:val="en-US"/>
@@ -1214,7 +1459,7 @@
         <w:rPr>
           <w:lang w:val="en-US"/>
         </w:rPr>
-        <w:t>In the terminal window, create a new virtual environment:</w:t>
+        <w:t>Enter the following command to clone the repo:</w:t>
       </w:r>
     </w:p>
     <w:p>
@@ -1236,49 +1481,562 @@
           <w:rFonts w:ascii="Cascadia Code" w:hAnsi="Cascadia Code"/>
           <w:lang w:val="en-US"/>
         </w:rPr>
-        <w:t xml:space="preserve">python -m </w:t>
-      </w:r>
-      <w:proofErr w:type="spellStart"/>
-      <w:proofErr w:type="gramStart"/>
+        <w:t>git clone &lt;github url&gt;</w:t>
+      </w:r>
+    </w:p>
+    <w:p>
+      <w:pPr>
+        <w:pStyle w:val="ListParagraph"/>
+        <w:numPr>
+          <w:ilvl w:val="0"/>
+          <w:numId w:val="12"/>
+        </w:numPr>
+        <w:rPr>
+          <w:lang w:val="en-US"/>
+        </w:rPr>
+      </w:pPr>
+      <w:r>
+        <w:rPr>
+          <w:lang w:val="en-US"/>
+        </w:rPr>
+        <w:t xml:space="preserve">Replace </w:t>
+      </w:r>
       <w:r>
         <w:rPr>
           <w:rFonts w:ascii="Cascadia Code" w:hAnsi="Cascadia Code"/>
           <w:lang w:val="en-US"/>
         </w:rPr>
-        <w:t>v</w:t>
+        <w:t>&lt;github url&gt;</w:t>
       </w:r>
       <w:r>
         <w:rPr>
           <w:rFonts w:ascii="Cascadia Code" w:hAnsi="Cascadia Code"/>
           <w:lang w:val="en-US"/>
         </w:rPr>
-        <w:t>e</w:t>
-      </w:r>
-      <w:r>
+        <w:t xml:space="preserve"> </w:t>
+      </w:r>
+      <w:r>
+        <w:rPr>
+          <w:lang w:val="en-US"/>
+        </w:rPr>
+        <w:t>with the GitHub URL for the specific day.</w:t>
+      </w:r>
+    </w:p>
+    <w:p>
+      <w:pPr>
+        <w:pStyle w:val="ListParagraph"/>
+        <w:numPr>
+          <w:ilvl w:val="0"/>
+          <w:numId w:val="12"/>
+        </w:numPr>
+        <w:rPr>
+          <w:lang w:val="en-US"/>
+        </w:rPr>
+      </w:pPr>
+      <w:r>
+        <w:rPr>
+          <w:lang w:val="en-US"/>
+        </w:rPr>
+        <w:t>For e.g.; for day #1, do this:</w:t>
+      </w:r>
+    </w:p>
+    <w:p>
+      <w:pPr>
+        <w:pBdr>
+          <w:top w:val="single" w:sz="4" w:space="1" w:color="auto"/>
+          <w:left w:val="single" w:sz="4" w:space="4" w:color="auto"/>
+          <w:bottom w:val="single" w:sz="4" w:space="1" w:color="auto"/>
+          <w:right w:val="single" w:sz="4" w:space="4" w:color="auto"/>
+        </w:pBdr>
+        <w:spacing w:after="0" w:line="240" w:lineRule="auto"/>
         <w:rPr>
           <w:rFonts w:ascii="Cascadia Code" w:hAnsi="Cascadia Code"/>
           <w:lang w:val="en-US"/>
         </w:rPr>
-        <w:t>nv</w:t>
-      </w:r>
-      <w:proofErr w:type="spellEnd"/>
+      </w:pPr>
       <w:r>
         <w:rPr>
           <w:rFonts w:ascii="Cascadia Code" w:hAnsi="Cascadia Code"/>
           <w:lang w:val="en-US"/>
         </w:rPr>
-        <w:t xml:space="preserve"> .</w:t>
-      </w:r>
-      <w:proofErr w:type="spellStart"/>
+        <w:t>git clone</w:t>
+      </w:r>
       <w:r>
         <w:rPr>
           <w:rFonts w:ascii="Cascadia Code" w:hAnsi="Cascadia Code"/>
           <w:lang w:val="en-US"/>
         </w:rPr>
-        <w:t>venv</w:t>
-      </w:r>
-      <w:proofErr w:type="spellEnd"/>
-      <w:proofErr w:type="gramEnd"/>
+        <w:t xml:space="preserve"> </w:t>
+      </w:r>
+      <w:hyperlink r:id="rId9" w:history="1">
+        <w:r>
+          <w:rPr>
+            <w:rStyle w:val="Hyperlink"/>
+            <w:lang w:val="en-US"/>
+          </w:rPr>
+          <w:t>https://github.com/AjaySingala/ajs_hx_day01_april2026.git</w:t>
+        </w:r>
+      </w:hyperlink>
+    </w:p>
+    <w:p>
+      <w:pPr>
+        <w:pStyle w:val="ListParagraph"/>
+        <w:numPr>
+          <w:ilvl w:val="0"/>
+          <w:numId w:val="12"/>
+        </w:numPr>
+        <w:rPr>
+          <w:lang w:val="en-US"/>
+        </w:rPr>
+      </w:pPr>
+      <w:r>
+        <w:rPr>
+          <w:lang w:val="en-US"/>
+        </w:rPr>
+        <w:t xml:space="preserve">This will create a folder named </w:t>
+      </w:r>
+      <w:r>
+        <w:rPr>
+          <w:rFonts w:ascii="Cascadia Code" w:hAnsi="Cascadia Code"/>
+          <w:lang w:val="en-US"/>
+        </w:rPr>
+        <w:t>ajs_hx_day01_april2026</w:t>
+      </w:r>
+      <w:r>
+        <w:rPr>
+          <w:lang w:val="en-US"/>
+        </w:rPr>
+        <w:t xml:space="preserve"> in your current directory.</w:t>
+      </w:r>
+    </w:p>
+    <w:p>
+      <w:pPr>
+        <w:pStyle w:val="ListParagraph"/>
+        <w:numPr>
+          <w:ilvl w:val="0"/>
+          <w:numId w:val="12"/>
+        </w:numPr>
+        <w:rPr>
+          <w:lang w:val="en-US"/>
+        </w:rPr>
+      </w:pPr>
+      <w:r>
+        <w:rPr>
+          <w:lang w:val="en-US"/>
+        </w:rPr>
+        <w:t>Open Visual Studio Code</w:t>
+      </w:r>
+      <w:r>
+        <w:rPr>
+          <w:lang w:val="en-US"/>
+        </w:rPr>
+        <w:t xml:space="preserve"> (VSC)</w:t>
+      </w:r>
+    </w:p>
+    <w:p>
+      <w:pPr>
+        <w:pStyle w:val="ListParagraph"/>
+        <w:numPr>
+          <w:ilvl w:val="0"/>
+          <w:numId w:val="12"/>
+        </w:numPr>
+        <w:rPr>
+          <w:lang w:val="en-US"/>
+        </w:rPr>
+      </w:pPr>
+      <w:r>
+        <w:rPr>
+          <w:lang w:val="en-US"/>
+        </w:rPr>
+        <w:t xml:space="preserve">Select </w:t>
+      </w:r>
+      <w:r>
+        <w:rPr>
+          <w:rFonts w:ascii="Cascadia Code" w:hAnsi="Cascadia Code"/>
+          <w:lang w:val="en-US"/>
+        </w:rPr>
+        <w:t>File -&gt; Open Folder</w:t>
+      </w:r>
+      <w:r>
+        <w:rPr>
+          <w:lang w:val="en-US"/>
+        </w:rPr>
+        <w:t xml:space="preserve"> (</w:t>
+      </w:r>
+      <w:r>
+        <w:rPr>
+          <w:i/>
+          <w:iCs/>
+          <w:lang w:val="en-US"/>
+        </w:rPr>
+        <w:t>or press CTRL+K+F</w:t>
+      </w:r>
+      <w:r>
+        <w:rPr>
+          <w:lang w:val="en-US"/>
+        </w:rPr>
+        <w:t>)</w:t>
+      </w:r>
+    </w:p>
+    <w:p>
+      <w:pPr>
+        <w:pStyle w:val="ListParagraph"/>
+        <w:numPr>
+          <w:ilvl w:val="0"/>
+          <w:numId w:val="12"/>
+        </w:numPr>
+        <w:rPr>
+          <w:lang w:val="en-US"/>
+        </w:rPr>
+      </w:pPr>
+      <w:r>
+        <w:rPr>
+          <w:lang w:val="en-US"/>
+        </w:rPr>
+        <w:t xml:space="preserve">Select the folder created after cloning, for e.g.; </w:t>
+      </w:r>
+      <w:r>
+        <w:rPr>
+          <w:rFonts w:ascii="Cascadia Code" w:hAnsi="Cascadia Code"/>
+          <w:lang w:val="en-US"/>
+        </w:rPr>
+        <w:t>ajs_hx_day01_april2026</w:t>
+      </w:r>
+      <w:r>
+        <w:rPr>
+          <w:rFonts w:ascii="Cascadia Code" w:hAnsi="Cascadia Code"/>
+          <w:lang w:val="en-US"/>
+        </w:rPr>
+        <w:t xml:space="preserve"> </w:t>
+      </w:r>
+      <w:r>
+        <w:rPr>
+          <w:lang w:val="en-US"/>
+        </w:rPr>
+        <w:t>for day #1.</w:t>
+      </w:r>
+    </w:p>
+    <w:p>
+      <w:pPr>
+        <w:pStyle w:val="ListParagraph"/>
+        <w:numPr>
+          <w:ilvl w:val="0"/>
+          <w:numId w:val="12"/>
+        </w:numPr>
+        <w:rPr>
+          <w:lang w:val="en-US"/>
+        </w:rPr>
+      </w:pPr>
+      <w:r>
+        <w:rPr>
+          <w:lang w:val="en-US"/>
+        </w:rPr>
+        <w:t>Click on the Open button</w:t>
+      </w:r>
+    </w:p>
+    <w:p>
+      <w:pPr>
+        <w:pStyle w:val="Heading2"/>
+        <w:rPr>
+          <w:lang w:val="en-US"/>
+        </w:rPr>
+      </w:pPr>
+      <w:bookmarkStart w:id="6" w:name="_Toc228192866"/>
+      <w:r>
+        <w:rPr>
+          <w:lang w:val="en-US"/>
+        </w:rPr>
+        <w:t>Environment Variables</w:t>
+      </w:r>
+      <w:bookmarkEnd w:id="6"/>
+    </w:p>
+    <w:p>
+      <w:pPr>
+        <w:rPr>
+          <w:lang w:val="en-US"/>
+        </w:rPr>
+      </w:pPr>
+      <w:r>
+        <w:rPr>
+          <w:lang w:val="en-US"/>
+        </w:rPr>
+        <w:t>To run your code, you will have to configure some environment variables.</w:t>
+      </w:r>
+    </w:p>
+    <w:p>
+      <w:pPr>
+        <w:rPr>
+          <w:lang w:val="en-US"/>
+        </w:rPr>
+      </w:pPr>
+      <w:r>
+        <w:rPr>
+          <w:lang w:val="en-US"/>
+        </w:rPr>
+        <w:t>Follow these steps:</w:t>
+      </w:r>
+    </w:p>
+    <w:p>
+      <w:pPr>
+        <w:pStyle w:val="ListParagraph"/>
+        <w:numPr>
+          <w:ilvl w:val="0"/>
+          <w:numId w:val="12"/>
+        </w:numPr>
+        <w:rPr>
+          <w:lang w:val="en-US"/>
+        </w:rPr>
+      </w:pPr>
+      <w:r>
+        <w:rPr>
+          <w:lang w:val="en-US"/>
+        </w:rPr>
+        <w:t xml:space="preserve">In the root folder of this project, where the file </w:t>
+      </w:r>
+      <w:r>
+        <w:rPr>
+          <w:rFonts w:ascii="Cascadia Code" w:hAnsi="Cascadia Code"/>
+          <w:lang w:val="en-US"/>
+        </w:rPr>
+        <w:t>config.py</w:t>
+      </w:r>
+      <w:r>
+        <w:rPr>
+          <w:lang w:val="en-US"/>
+        </w:rPr>
+        <w:t xml:space="preserve"> exists, create the file named </w:t>
+      </w:r>
+      <w:r>
+        <w:rPr>
+          <w:rFonts w:ascii="Cascadia Code" w:hAnsi="Cascadia Code" w:cs="Cascadia Code"/>
+          <w:lang w:val="en-US"/>
+        </w:rPr>
+        <w:t>.env</w:t>
+      </w:r>
+      <w:r>
+        <w:rPr>
+          <w:lang w:val="en-US"/>
+        </w:rPr>
+        <w:t xml:space="preserve"> for your environment variables:</w:t>
+      </w:r>
+    </w:p>
+    <w:p>
+      <w:pPr>
+        <w:pStyle w:val="ListParagraph"/>
+        <w:numPr>
+          <w:ilvl w:val="0"/>
+          <w:numId w:val="12"/>
+        </w:numPr>
+        <w:rPr>
+          <w:lang w:val="en-US"/>
+        </w:rPr>
+      </w:pPr>
+      <w:r>
+        <w:rPr>
+          <w:lang w:val="en-US"/>
+        </w:rPr>
+        <w:t xml:space="preserve">Click on </w:t>
+      </w:r>
+      <w:r>
+        <w:rPr>
+          <w:rFonts w:ascii="Cascadia Code" w:hAnsi="Cascadia Code" w:cs="Cascadia Code"/>
+          <w:lang w:val="en-US"/>
+        </w:rPr>
+        <w:t>config.py</w:t>
+      </w:r>
+    </w:p>
+    <w:p>
+      <w:pPr>
+        <w:pStyle w:val="ListParagraph"/>
+        <w:numPr>
+          <w:ilvl w:val="0"/>
+          <w:numId w:val="12"/>
+        </w:numPr>
+        <w:rPr>
+          <w:lang w:val="en-US"/>
+        </w:rPr>
+      </w:pPr>
+      <w:r>
+        <w:rPr>
+          <w:lang w:val="en-US"/>
+        </w:rPr>
+        <w:t xml:space="preserve">Click on the icon to create a new file or select </w:t>
+      </w:r>
+      <w:r>
+        <w:rPr>
+          <w:rFonts w:ascii="Cascadia Code" w:hAnsi="Cascadia Code" w:cs="Cascadia Code"/>
+          <w:lang w:val="en-US"/>
+        </w:rPr>
+        <w:t xml:space="preserve">File -&gt; New File </w:t>
+      </w:r>
+      <w:r>
+        <w:rPr>
+          <w:lang w:val="en-US"/>
+        </w:rPr>
+        <w:t>from the menu</w:t>
+      </w:r>
+    </w:p>
+    <w:p>
+      <w:pPr>
+        <w:pStyle w:val="ListParagraph"/>
+        <w:numPr>
+          <w:ilvl w:val="0"/>
+          <w:numId w:val="12"/>
+        </w:numPr>
+        <w:rPr>
+          <w:lang w:val="en-US"/>
+        </w:rPr>
+      </w:pPr>
+      <w:r>
+        <w:rPr>
+          <w:lang w:val="en-US"/>
+        </w:rPr>
+        <w:t xml:space="preserve">Ener the filename as </w:t>
+      </w:r>
+      <w:r>
+        <w:rPr>
+          <w:rFonts w:ascii="Cascadia Code" w:hAnsi="Cascadia Code"/>
+          <w:lang w:val="en-US"/>
+        </w:rPr>
+        <w:t>.env</w:t>
+      </w:r>
+    </w:p>
+    <w:p>
+      <w:pPr>
+        <w:pStyle w:val="ListParagraph"/>
+        <w:numPr>
+          <w:ilvl w:val="0"/>
+          <w:numId w:val="12"/>
+        </w:numPr>
+        <w:rPr>
+          <w:lang w:val="en-US"/>
+        </w:rPr>
+      </w:pPr>
+      <w:r>
+        <w:rPr>
+          <w:lang w:val="en-US"/>
+        </w:rPr>
+        <w:t xml:space="preserve">Add the following lines to this </w:t>
+      </w:r>
+      <w:r>
+        <w:rPr>
+          <w:rFonts w:ascii="Cascadia Code" w:hAnsi="Cascadia Code" w:cs="Cascadia Code"/>
+          <w:lang w:val="en-US"/>
+        </w:rPr>
+        <w:t xml:space="preserve">.env </w:t>
+      </w:r>
+      <w:r>
+        <w:rPr>
+          <w:lang w:val="en-US"/>
+        </w:rPr>
+        <w:t>file</w:t>
+      </w:r>
+      <w:r>
+        <w:rPr>
+          <w:lang w:val="en-US"/>
+        </w:rPr>
+        <w:t xml:space="preserve"> and then save the file:</w:t>
+      </w:r>
+    </w:p>
+    <w:p>
+      <w:pPr>
+        <w:pBdr>
+          <w:top w:val="single" w:sz="4" w:space="1" w:color="auto"/>
+          <w:left w:val="single" w:sz="4" w:space="4" w:color="auto"/>
+          <w:bottom w:val="single" w:sz="4" w:space="1" w:color="auto"/>
+          <w:right w:val="single" w:sz="4" w:space="4" w:color="auto"/>
+        </w:pBdr>
+        <w:spacing w:after="0" w:line="240" w:lineRule="auto"/>
+        <w:rPr>
+          <w:rFonts w:ascii="Cascadia Code" w:hAnsi="Cascadia Code" w:cs="Cascadia Code"/>
+        </w:rPr>
+      </w:pPr>
+      <w:r>
+        <w:rPr>
+          <w:rFonts w:ascii="Cascadia Code" w:hAnsi="Cascadia Code" w:cs="Cascadia Code"/>
+        </w:rPr>
+        <w:t>AZURE_OPENAI_API_KEY="&lt;YOUR AZURE_OPENAI_API_KEY&gt;"</w:t>
+      </w:r>
+    </w:p>
+    <w:p>
+      <w:pPr>
+        <w:pBdr>
+          <w:top w:val="single" w:sz="4" w:space="1" w:color="auto"/>
+          <w:left w:val="single" w:sz="4" w:space="4" w:color="auto"/>
+          <w:bottom w:val="single" w:sz="4" w:space="1" w:color="auto"/>
+          <w:right w:val="single" w:sz="4" w:space="4" w:color="auto"/>
+        </w:pBdr>
+        <w:spacing w:after="0" w:line="240" w:lineRule="auto"/>
+        <w:rPr>
+          <w:rFonts w:ascii="Cascadia Code" w:hAnsi="Cascadia Code" w:cs="Cascadia Code"/>
+        </w:rPr>
+      </w:pPr>
+      <w:r>
+        <w:rPr>
+          <w:rFonts w:ascii="Cascadia Code" w:hAnsi="Cascadia Code" w:cs="Cascadia Code"/>
+        </w:rPr>
+        <w:t>AZURE_OPENAI_ENDPOINT="&lt;YOUR AZURE_OPENAI_ENDPOINT&gt;"</w:t>
+      </w:r>
+    </w:p>
+    <w:p>
+      <w:pPr>
+        <w:pBdr>
+          <w:top w:val="single" w:sz="4" w:space="1" w:color="auto"/>
+          <w:left w:val="single" w:sz="4" w:space="4" w:color="auto"/>
+          <w:bottom w:val="single" w:sz="4" w:space="1" w:color="auto"/>
+          <w:right w:val="single" w:sz="4" w:space="4" w:color="auto"/>
+        </w:pBdr>
+        <w:spacing w:after="0" w:line="240" w:lineRule="auto"/>
+        <w:rPr>
+          <w:rFonts w:ascii="Cascadia Code" w:hAnsi="Cascadia Code" w:cs="Cascadia Code"/>
+        </w:rPr>
+      </w:pPr>
+      <w:r>
+        <w:rPr>
+          <w:rFonts w:ascii="Cascadia Code" w:hAnsi="Cascadia Code" w:cs="Cascadia Code"/>
+        </w:rPr>
+        <w:t>AZURE_OPENAI_DEPLOYMENT=gpt-4o-mini</w:t>
+      </w:r>
+    </w:p>
+    <w:p>
+      <w:pPr>
+        <w:pBdr>
+          <w:top w:val="single" w:sz="4" w:space="1" w:color="auto"/>
+          <w:left w:val="single" w:sz="4" w:space="4" w:color="auto"/>
+          <w:bottom w:val="single" w:sz="4" w:space="1" w:color="auto"/>
+          <w:right w:val="single" w:sz="4" w:space="4" w:color="auto"/>
+        </w:pBdr>
+        <w:spacing w:after="0" w:line="240" w:lineRule="auto"/>
+        <w:rPr>
+          <w:rFonts w:ascii="Cascadia Code" w:hAnsi="Cascadia Code" w:cs="Cascadia Code"/>
+        </w:rPr>
+      </w:pPr>
+      <w:r>
+        <w:rPr>
+          <w:rFonts w:ascii="Cascadia Code" w:hAnsi="Cascadia Code" w:cs="Cascadia Code"/>
+        </w:rPr>
+        <w:t>AZURE_OPENAI_API_VERSION=2024-02-15-preview</w:t>
+      </w:r>
+    </w:p>
+    <w:p>
+      <w:pPr>
+        <w:pBdr>
+          <w:top w:val="single" w:sz="4" w:space="1" w:color="auto"/>
+          <w:left w:val="single" w:sz="4" w:space="4" w:color="auto"/>
+          <w:bottom w:val="single" w:sz="4" w:space="1" w:color="auto"/>
+          <w:right w:val="single" w:sz="4" w:space="4" w:color="auto"/>
+        </w:pBdr>
+        <w:spacing w:after="0" w:line="240" w:lineRule="auto"/>
+        <w:rPr>
+          <w:rFonts w:ascii="Cascadia Code" w:hAnsi="Cascadia Code" w:cs="Cascadia Code"/>
+        </w:rPr>
+      </w:pPr>
+      <w:r>
+        <w:rPr>
+          <w:rFonts w:ascii="Cascadia Code" w:hAnsi="Cascadia Code" w:cs="Cascadia Code"/>
+        </w:rPr>
+        <w:t>AZURE_OPENAI_EMBEDDING_DEPLOYMENT=text-embedding-3-small</w:t>
+      </w:r>
     </w:p>
     <w:p>
       <w:pPr>
@@ -1295,21 +2053,279 @@
         <w:rPr>
           <w:lang w:val="en-US"/>
         </w:rPr>
-        <w:t xml:space="preserve">If you have multiple versions of Python installed on your machine, then create the environment using the </w:t>
-      </w:r>
-      <w:proofErr w:type="gramStart"/>
-      <w:r>
-        <w:rPr>
-          <w:lang w:val="en-US"/>
-        </w:rPr>
-        <w:t>specific  python</w:t>
-      </w:r>
-      <w:proofErr w:type="gramEnd"/>
-      <w:r>
-        <w:rPr>
-          <w:lang w:val="en-US"/>
-        </w:rPr>
-        <w:t xml:space="preserve"> version.</w:t>
+        <w:t xml:space="preserve">Replace </w:t>
+      </w:r>
+      <w:r>
+        <w:rPr>
+          <w:rFonts w:ascii="Cascadia Code" w:hAnsi="Cascadia Code" w:cs="Cascadia Code"/>
+        </w:rPr>
+        <w:t>="&lt;YOUR AZURE_OPENAI_API_KEY&gt;</w:t>
+      </w:r>
+      <w:r>
+        <w:rPr>
+          <w:lang w:val="en-US"/>
+        </w:rPr>
+        <w:t xml:space="preserve"> with the Key you copied from your Azure OpenAI resource.</w:t>
+      </w:r>
+    </w:p>
+    <w:p>
+      <w:pPr>
+        <w:pStyle w:val="ListParagraph"/>
+        <w:numPr>
+          <w:ilvl w:val="0"/>
+          <w:numId w:val="11"/>
+        </w:numPr>
+        <w:rPr>
+          <w:lang w:val="en-US"/>
+        </w:rPr>
+      </w:pPr>
+      <w:r>
+        <w:rPr>
+          <w:lang w:val="en-US"/>
+        </w:rPr>
+        <w:t xml:space="preserve">Replace </w:t>
+      </w:r>
+      <w:r>
+        <w:rPr>
+          <w:rFonts w:ascii="Cascadia Code" w:hAnsi="Cascadia Code" w:cs="Cascadia Code"/>
+        </w:rPr>
+        <w:t>&lt;YOUR AZURE_OPENAI_ENDPOINT&gt;"</w:t>
+      </w:r>
+      <w:r>
+        <w:rPr>
+          <w:lang w:val="en-US"/>
+        </w:rPr>
+        <w:t xml:space="preserve"> with the endpoint value you copied from your Azure OpenAI resource.</w:t>
+      </w:r>
+    </w:p>
+    <w:p>
+      <w:pPr>
+        <w:pBdr>
+          <w:top w:val="single" w:sz="4" w:space="1" w:color="auto"/>
+          <w:left w:val="single" w:sz="4" w:space="4" w:color="auto"/>
+          <w:bottom w:val="single" w:sz="4" w:space="1" w:color="auto"/>
+          <w:right w:val="single" w:sz="4" w:space="4" w:color="auto"/>
+        </w:pBdr>
+        <w:rPr>
+          <w:b/>
+          <w:bCs/>
+          <w:lang w:val="en-US"/>
+        </w:rPr>
+      </w:pPr>
+      <w:r>
+        <w:rPr>
+          <w:b/>
+          <w:bCs/>
+          <w:lang w:val="en-US"/>
+        </w:rPr>
+        <w:t>Notes:</w:t>
+      </w:r>
+    </w:p>
+    <w:p>
+      <w:pPr>
+        <w:pStyle w:val="ListParagraph"/>
+        <w:numPr>
+          <w:ilvl w:val="0"/>
+          <w:numId w:val="11"/>
+        </w:numPr>
+        <w:pBdr>
+          <w:top w:val="single" w:sz="4" w:space="1" w:color="auto"/>
+          <w:left w:val="single" w:sz="4" w:space="4" w:color="auto"/>
+          <w:bottom w:val="single" w:sz="4" w:space="1" w:color="auto"/>
+          <w:right w:val="single" w:sz="4" w:space="4" w:color="auto"/>
+        </w:pBdr>
+        <w:rPr>
+          <w:lang w:val="en-US"/>
+        </w:rPr>
+      </w:pPr>
+      <w:r>
+        <w:rPr>
+          <w:lang w:val="en-US"/>
+        </w:rPr>
+        <w:t xml:space="preserve">The </w:t>
+      </w:r>
+      <w:r>
+        <w:rPr>
+          <w:rFonts w:ascii="Cascadia Code" w:hAnsi="Cascadia Code" w:cs="Cascadia Code"/>
+          <w:lang w:val="en-US"/>
+        </w:rPr>
+        <w:t>.env</w:t>
+      </w:r>
+      <w:r>
+        <w:rPr>
+          <w:lang w:val="en-US"/>
+        </w:rPr>
+        <w:t xml:space="preserve"> file is to be created in the root folder of the project </w:t>
+      </w:r>
+      <w:r>
+        <w:rPr>
+          <w:lang w:val="en-US"/>
+        </w:rPr>
+        <w:t xml:space="preserve">for the day. For e.g.; </w:t>
+      </w:r>
+      <w:r>
+        <w:rPr>
+          <w:rFonts w:ascii="Cascadia Code" w:hAnsi="Cascadia Code"/>
+          <w:lang w:val="en-US"/>
+        </w:rPr>
+        <w:t>ajs_hx_day01_april2026</w:t>
+      </w:r>
+      <w:r>
+        <w:rPr>
+          <w:lang w:val="en-US"/>
+        </w:rPr>
+        <w:t>.</w:t>
+      </w:r>
+    </w:p>
+    <w:p>
+      <w:pPr>
+        <w:pStyle w:val="ListParagraph"/>
+        <w:numPr>
+          <w:ilvl w:val="0"/>
+          <w:numId w:val="11"/>
+        </w:numPr>
+        <w:pBdr>
+          <w:top w:val="single" w:sz="4" w:space="1" w:color="auto"/>
+          <w:left w:val="single" w:sz="4" w:space="4" w:color="auto"/>
+          <w:bottom w:val="single" w:sz="4" w:space="1" w:color="auto"/>
+          <w:right w:val="single" w:sz="4" w:space="4" w:color="auto"/>
+        </w:pBdr>
+        <w:rPr>
+          <w:lang w:val="en-US"/>
+        </w:rPr>
+      </w:pPr>
+      <w:r>
+        <w:rPr>
+          <w:lang w:val="en-US"/>
+        </w:rPr>
+        <w:t xml:space="preserve">It must be located along with the </w:t>
+      </w:r>
+      <w:r>
+        <w:rPr>
+          <w:rFonts w:ascii="Cascadia Code" w:hAnsi="Cascadia Code" w:cs="Cascadia Code"/>
+          <w:lang w:val="en-US"/>
+        </w:rPr>
+        <w:t>config.py</w:t>
+      </w:r>
+      <w:r>
+        <w:rPr>
+          <w:lang w:val="en-US"/>
+        </w:rPr>
+        <w:t xml:space="preserve"> file and not in any of the sub-folders.</w:t>
+      </w:r>
+    </w:p>
+    <w:p>
+      <w:pPr>
+        <w:rPr>
+          <w:lang w:val="en-US"/>
+        </w:rPr>
+      </w:pPr>
+    </w:p>
+    <w:p>
+      <w:pPr>
+        <w:pStyle w:val="Heading1"/>
+        <w:rPr>
+          <w:lang w:val="en-US"/>
+        </w:rPr>
+      </w:pPr>
+      <w:bookmarkStart w:id="7" w:name="_Toc228192867"/>
+      <w:r>
+        <w:rPr>
+          <w:lang w:val="en-US"/>
+        </w:rPr>
+        <w:lastRenderedPageBreak/>
+        <w:t>Setup Local Virtual Python Environment</w:t>
+      </w:r>
+      <w:bookmarkEnd w:id="7"/>
+    </w:p>
+    <w:p>
+      <w:pPr>
+        <w:pStyle w:val="ListParagraph"/>
+        <w:numPr>
+          <w:ilvl w:val="0"/>
+          <w:numId w:val="11"/>
+        </w:numPr>
+        <w:rPr>
+          <w:lang w:val="en-US"/>
+        </w:rPr>
+      </w:pPr>
+      <w:r>
+        <w:rPr>
+          <w:lang w:val="en-US"/>
+        </w:rPr>
+        <w:t>Open your project’s folder in VS Code (VSC).</w:t>
+      </w:r>
+    </w:p>
+    <w:p>
+      <w:pPr>
+        <w:pStyle w:val="ListParagraph"/>
+        <w:numPr>
+          <w:ilvl w:val="0"/>
+          <w:numId w:val="11"/>
+        </w:numPr>
+        <w:rPr>
+          <w:lang w:val="en-US"/>
+        </w:rPr>
+      </w:pPr>
+      <w:r>
+        <w:rPr>
+          <w:lang w:val="en-US"/>
+        </w:rPr>
+        <w:t>In the terminal window, create a new virtual environment:</w:t>
+      </w:r>
+    </w:p>
+    <w:p>
+      <w:pPr>
+        <w:pBdr>
+          <w:top w:val="single" w:sz="4" w:space="1" w:color="auto"/>
+          <w:left w:val="single" w:sz="4" w:space="4" w:color="auto"/>
+          <w:bottom w:val="single" w:sz="4" w:space="1" w:color="auto"/>
+          <w:right w:val="single" w:sz="4" w:space="4" w:color="auto"/>
+        </w:pBdr>
+        <w:spacing w:after="0" w:line="240" w:lineRule="auto"/>
+        <w:rPr>
+          <w:rFonts w:ascii="Cascadia Code" w:hAnsi="Cascadia Code"/>
+          <w:lang w:val="en-US"/>
+        </w:rPr>
+      </w:pPr>
+      <w:r>
+        <w:rPr>
+          <w:rFonts w:ascii="Cascadia Code" w:hAnsi="Cascadia Code"/>
+          <w:lang w:val="en-US"/>
+        </w:rPr>
+        <w:t>python -m v</w:t>
+      </w:r>
+      <w:r>
+        <w:rPr>
+          <w:rFonts w:ascii="Cascadia Code" w:hAnsi="Cascadia Code"/>
+          <w:lang w:val="en-US"/>
+        </w:rPr>
+        <w:t>e</w:t>
+      </w:r>
+      <w:r>
+        <w:rPr>
+          <w:rFonts w:ascii="Cascadia Code" w:hAnsi="Cascadia Code"/>
+          <w:lang w:val="en-US"/>
+        </w:rPr>
+        <w:t>nv .venv</w:t>
+      </w:r>
+    </w:p>
+    <w:p>
+      <w:pPr>
+        <w:pStyle w:val="ListParagraph"/>
+        <w:numPr>
+          <w:ilvl w:val="0"/>
+          <w:numId w:val="11"/>
+        </w:numPr>
+        <w:rPr>
+          <w:lang w:val="en-US"/>
+        </w:rPr>
+      </w:pPr>
+      <w:r>
+        <w:rPr>
+          <w:lang w:val="en-US"/>
+        </w:rPr>
+        <w:t>If you have multiple versions of Python installed on your machine, then create the environment using the specific  python version.</w:t>
       </w:r>
     </w:p>
     <w:p>
@@ -1327,21 +2343,7 @@
         <w:rPr>
           <w:lang w:val="en-US"/>
         </w:rPr>
-        <w:t xml:space="preserve">For </w:t>
-      </w:r>
-      <w:proofErr w:type="gramStart"/>
-      <w:r>
-        <w:rPr>
-          <w:lang w:val="en-US"/>
-        </w:rPr>
-        <w:t>e.g.;</w:t>
-      </w:r>
-      <w:proofErr w:type="gramEnd"/>
-      <w:r>
-        <w:rPr>
-          <w:lang w:val="en-US"/>
-        </w:rPr>
-        <w:t xml:space="preserve"> if you have Python 3.10, 3.11 and 3.13 installed, but want to work with Python 3.13 for your specific project,</w:t>
+        <w:t>For e.g.; if you have Python 3.10, 3.11 and 3.13 installed, but want to work with Python 3.13 for your specific project,</w:t>
       </w:r>
       <w:r>
         <w:rPr>
@@ -1433,49 +2435,22 @@
           <w:rFonts w:ascii="Cascadia Code" w:hAnsi="Cascadia Code"/>
           <w:lang w:val="en-US"/>
         </w:rPr>
-        <w:t xml:space="preserve">python -m </w:t>
-      </w:r>
-      <w:proofErr w:type="spellStart"/>
-      <w:proofErr w:type="gramStart"/>
+        <w:t>python -m v</w:t>
+      </w:r>
       <w:r>
         <w:rPr>
           <w:rFonts w:ascii="Cascadia Code" w:hAnsi="Cascadia Code"/>
           <w:lang w:val="en-US"/>
         </w:rPr>
-        <w:t>v</w:t>
+        <w:t>e</w:t>
       </w:r>
       <w:r>
         <w:rPr>
           <w:rFonts w:ascii="Cascadia Code" w:hAnsi="Cascadia Code"/>
           <w:lang w:val="en-US"/>
         </w:rPr>
-        <w:t>e</w:t>
-      </w:r>
-      <w:r>
-        <w:rPr>
-          <w:rFonts w:ascii="Cascadia Code" w:hAnsi="Cascadia Code"/>
-          <w:lang w:val="en-US"/>
-        </w:rPr>
-        <w:t>nv</w:t>
-      </w:r>
-      <w:proofErr w:type="spellEnd"/>
-      <w:r>
-        <w:rPr>
-          <w:rFonts w:ascii="Cascadia Code" w:hAnsi="Cascadia Code"/>
-          <w:lang w:val="en-US"/>
-        </w:rPr>
-        <w:t xml:space="preserve"> .</w:t>
-      </w:r>
-      <w:proofErr w:type="spellStart"/>
-      <w:r>
-        <w:rPr>
-          <w:rFonts w:ascii="Cascadia Code" w:hAnsi="Cascadia Code"/>
-          <w:lang w:val="en-US"/>
-        </w:rPr>
-        <w:t>venv</w:t>
-      </w:r>
-      <w:proofErr w:type="spellEnd"/>
-      <w:proofErr w:type="gramEnd"/>
+        <w:t>nv .venv</w:t>
+      </w:r>
     </w:p>
     <w:p>
       <w:pPr>
@@ -1509,7 +2484,6 @@
           <w:lang w:val="en-US"/>
         </w:rPr>
       </w:pPr>
-      <w:proofErr w:type="gramStart"/>
       <w:r>
         <w:rPr>
           <w:rFonts w:ascii="Cascadia Code" w:hAnsi="Cascadia Code"/>
@@ -1522,18 +2496,8 @@
           <w:rFonts w:ascii="Cascadia Code" w:hAnsi="Cascadia Code"/>
           <w:lang w:val="en-US"/>
         </w:rPr>
-        <w:t>.</w:t>
-      </w:r>
-      <w:proofErr w:type="spellStart"/>
-      <w:r>
-        <w:rPr>
-          <w:rFonts w:ascii="Cascadia Code" w:hAnsi="Cascadia Code"/>
-          <w:lang w:val="en-US"/>
-        </w:rPr>
-        <w:t>venv</w:t>
-      </w:r>
-      <w:proofErr w:type="spellEnd"/>
-      <w:proofErr w:type="gramEnd"/>
+        <w:t>.venv</w:t>
+      </w:r>
       <w:r>
         <w:rPr>
           <w:rFonts w:ascii="Cascadia Code" w:hAnsi="Cascadia Code"/>
@@ -1564,21 +2528,26 @@
         <w:rPr>
           <w:lang w:val="en-US"/>
         </w:rPr>
-        <w:t>The prompt on the terminal should show (.</w:t>
-      </w:r>
-      <w:proofErr w:type="spellStart"/>
-      <w:r>
-        <w:rPr>
-          <w:lang w:val="en-US"/>
-        </w:rPr>
-        <w:t>venv</w:t>
-      </w:r>
-      <w:proofErr w:type="spellEnd"/>
+        <w:t>The prompt on the terminal should show (</w:t>
+      </w:r>
+      <w:r>
+        <w:rPr>
+          <w:rFonts w:ascii="Cascadia Code" w:hAnsi="Cascadia Code" w:cs="Cascadia Code"/>
+          <w:lang w:val="en-US"/>
+        </w:rPr>
+        <w:t>.venv</w:t>
+      </w:r>
       <w:r>
         <w:rPr>
           <w:lang w:val="en-US"/>
         </w:rPr>
         <w:t>) on the left.</w:t>
+      </w:r>
+      <w:r>
+        <w:rPr>
+          <w:lang w:val="en-US"/>
+        </w:rPr>
+        <w:t xml:space="preserve"> A sample output is given below:</w:t>
       </w:r>
     </w:p>
     <w:p>
@@ -1592,63 +2561,27 @@
         <w:spacing w:after="0" w:line="240" w:lineRule="auto"/>
         <w:rPr>
           <w:rFonts w:ascii="Cascadia Code" w:hAnsi="Cascadia Code"/>
+          <w:color w:val="FFFFFF" w:themeColor="background1"/>
           <w:lang w:val="en-US"/>
         </w:rPr>
       </w:pPr>
       <w:r>
         <w:rPr>
           <w:rFonts w:ascii="Cascadia Code" w:hAnsi="Cascadia Code"/>
-          <w:lang w:val="en-US"/>
-        </w:rPr>
-        <w:t>(.</w:t>
-      </w:r>
-      <w:proofErr w:type="spellStart"/>
+          <w:color w:val="8DD873" w:themeColor="accent6" w:themeTint="99"/>
+          <w:highlight w:val="black"/>
+          <w:lang w:val="en-US"/>
+        </w:rPr>
+        <w:t>(.venv)</w:t>
+      </w:r>
       <w:r>
         <w:rPr>
           <w:rFonts w:ascii="Cascadia Code" w:hAnsi="Cascadia Code"/>
-          <w:lang w:val="en-US"/>
-        </w:rPr>
-        <w:t>venv</w:t>
-      </w:r>
-      <w:proofErr w:type="spellEnd"/>
-      <w:r>
-        <w:rPr>
-          <w:rFonts w:ascii="Cascadia Code" w:hAnsi="Cascadia Code"/>
-          <w:lang w:val="en-US"/>
-        </w:rPr>
-        <w:t xml:space="preserve">) </w:t>
-      </w:r>
-      <w:proofErr w:type="spellStart"/>
-      <w:r>
-        <w:rPr>
-          <w:rFonts w:ascii="Cascadia Code" w:hAnsi="Cascadia Code"/>
-          <w:lang w:val="en-US"/>
-        </w:rPr>
-        <w:t>labuser@</w:t>
-      </w:r>
-      <w:proofErr w:type="gramStart"/>
-      <w:r>
-        <w:rPr>
-          <w:rFonts w:ascii="Cascadia Code" w:hAnsi="Cascadia Code"/>
-          <w:lang w:val="en-US"/>
-        </w:rPr>
-        <w:t>ubuntu</w:t>
-      </w:r>
-      <w:proofErr w:type="spellEnd"/>
-      <w:r>
-        <w:rPr>
-          <w:rFonts w:ascii="Cascadia Code" w:hAnsi="Cascadia Code"/>
-          <w:lang w:val="en-US"/>
-        </w:rPr>
-        <w:t>:~</w:t>
-      </w:r>
-      <w:proofErr w:type="gramEnd"/>
-      <w:r>
-        <w:rPr>
-          <w:rFonts w:ascii="Cascadia Code" w:hAnsi="Cascadia Code"/>
-          <w:lang w:val="en-US"/>
-        </w:rPr>
-        <w:t>/ajs_hx_code_april2026/demo01_tokens$</w:t>
+          <w:color w:val="FFFFFF" w:themeColor="background1"/>
+          <w:highlight w:val="black"/>
+          <w:lang w:val="en-US"/>
+        </w:rPr>
+        <w:t xml:space="preserve"> labuser@ubuntu:~/ajs_hx_code_april2026/demo01_tokens$</w:t>
       </w:r>
     </w:p>
     <w:p>
@@ -1732,7 +2665,7 @@
                     <pic:cNvPicPr/>
                   </pic:nvPicPr>
                   <pic:blipFill>
-                    <a:blip r:embed="rId8"/>
+                    <a:blip r:embed="rId10"/>
                     <a:stretch>
                       <a:fillRect/>
                     </a:stretch>
@@ -1773,52 +2706,25 @@
     </w:p>
     <w:p>
       <w:pPr>
-        <w:pStyle w:val="Heading2"/>
-        <w:rPr>
-          <w:lang w:val="en-US"/>
-        </w:rPr>
-      </w:pPr>
-      <w:bookmarkStart w:id="6" w:name="_Toc227773862"/>
-      <w:proofErr w:type="gramStart"/>
-      <w:r>
-        <w:rPr>
-          <w:lang w:val="en-US"/>
-        </w:rPr>
-        <w:t>Environment</w:t>
-      </w:r>
-      <w:proofErr w:type="gramEnd"/>
-      <w:r>
-        <w:rPr>
-          <w:lang w:val="en-US"/>
-        </w:rPr>
-        <w:t xml:space="preserve"> Variables</w:t>
-      </w:r>
-      <w:bookmarkEnd w:id="6"/>
-    </w:p>
-    <w:p>
-      <w:pPr>
-        <w:rPr>
-          <w:lang w:val="en-US"/>
-        </w:rPr>
-      </w:pPr>
-      <w:r>
-        <w:rPr>
-          <w:lang w:val="en-US"/>
-        </w:rPr>
-        <w:t>To run your code, you will have to configure some environment variables.</w:t>
-      </w:r>
-    </w:p>
-    <w:p>
-      <w:pPr>
-        <w:rPr>
-          <w:lang w:val="en-US"/>
-        </w:rPr>
-      </w:pPr>
-      <w:r>
-        <w:rPr>
-          <w:lang w:val="en-US"/>
-        </w:rPr>
-        <w:t>Follow these steps:</w:t>
+        <w:pBdr>
+          <w:top w:val="single" w:sz="4" w:space="1" w:color="auto"/>
+          <w:left w:val="single" w:sz="4" w:space="4" w:color="auto"/>
+          <w:bottom w:val="single" w:sz="4" w:space="1" w:color="auto"/>
+          <w:right w:val="single" w:sz="4" w:space="4" w:color="auto"/>
+        </w:pBdr>
+        <w:rPr>
+          <w:b/>
+          <w:bCs/>
+          <w:lang w:val="en-US"/>
+        </w:rPr>
+      </w:pPr>
+      <w:r>
+        <w:rPr>
+          <w:b/>
+          <w:bCs/>
+          <w:lang w:val="en-US"/>
+        </w:rPr>
+        <w:t>Notes:</w:t>
       </w:r>
     </w:p>
     <w:p>
@@ -1828,30 +2734,22 @@
           <w:ilvl w:val="0"/>
           <w:numId w:val="11"/>
         </w:numPr>
-        <w:rPr>
-          <w:lang w:val="en-US"/>
-        </w:rPr>
-      </w:pPr>
-      <w:r>
-        <w:rPr>
-          <w:lang w:val="en-US"/>
-        </w:rPr>
-        <w:t xml:space="preserve">In the root folder of your project, create a file </w:t>
-      </w:r>
-      <w:proofErr w:type="gramStart"/>
-      <w:r>
-        <w:rPr>
-          <w:lang w:val="en-US"/>
-        </w:rPr>
-        <w:t>named</w:t>
-      </w:r>
-      <w:r>
-        <w:rPr>
-          <w:rFonts w:ascii="Cascadia Code" w:hAnsi="Cascadia Code" w:cs="Cascadia Code"/>
-        </w:rPr>
-        <w:t xml:space="preserve"> .env</w:t>
-      </w:r>
-      <w:proofErr w:type="gramEnd"/>
+        <w:pBdr>
+          <w:top w:val="single" w:sz="4" w:space="1" w:color="auto"/>
+          <w:left w:val="single" w:sz="4" w:space="4" w:color="auto"/>
+          <w:bottom w:val="single" w:sz="4" w:space="1" w:color="auto"/>
+          <w:right w:val="single" w:sz="4" w:space="4" w:color="auto"/>
+        </w:pBdr>
+        <w:rPr>
+          <w:lang w:val="en-US"/>
+        </w:rPr>
+      </w:pPr>
+      <w:r>
+        <w:rPr>
+          <w:lang w:val="en-US"/>
+        </w:rPr>
+        <w:t>This setting to create a virtual environment is to be done only once for the specific day’s HOLs. You don’t have to do it every time you open the folder in VS.</w:t>
+      </w:r>
     </w:p>
     <w:p>
       <w:pPr>
@@ -1860,15 +2758,279 @@
           <w:ilvl w:val="0"/>
           <w:numId w:val="11"/>
         </w:numPr>
-        <w:rPr>
-          <w:lang w:val="en-US"/>
-        </w:rPr>
-      </w:pPr>
-      <w:r>
-        <w:rPr>
-          <w:lang w:val="en-US"/>
-        </w:rPr>
-        <w:t>Add the following lines to this file:</w:t>
+        <w:pBdr>
+          <w:top w:val="single" w:sz="4" w:space="1" w:color="auto"/>
+          <w:left w:val="single" w:sz="4" w:space="4" w:color="auto"/>
+          <w:bottom w:val="single" w:sz="4" w:space="1" w:color="auto"/>
+          <w:right w:val="single" w:sz="4" w:space="4" w:color="auto"/>
+        </w:pBdr>
+        <w:rPr>
+          <w:lang w:val="en-US"/>
+        </w:rPr>
+      </w:pPr>
+      <w:r>
+        <w:rPr>
+          <w:lang w:val="en-US"/>
+        </w:rPr>
+        <w:t xml:space="preserve">If the </w:t>
+      </w:r>
+      <w:r>
+        <w:rPr>
+          <w:rFonts w:ascii="Cascadia Code" w:hAnsi="Cascadia Code" w:cs="Cascadia Code"/>
+          <w:lang w:val="en-US"/>
+        </w:rPr>
+        <w:t>.venv</w:t>
+      </w:r>
+      <w:r>
+        <w:rPr>
+          <w:lang w:val="en-US"/>
+        </w:rPr>
+        <w:t xml:space="preserve"> folder is deleted for whatever reason, then you will have to repeat these steps all over again.</w:t>
+      </w:r>
+    </w:p>
+    <w:p>
+      <w:pPr>
+        <w:pStyle w:val="ListParagraph"/>
+        <w:numPr>
+          <w:ilvl w:val="0"/>
+          <w:numId w:val="11"/>
+        </w:numPr>
+        <w:pBdr>
+          <w:top w:val="single" w:sz="4" w:space="1" w:color="auto"/>
+          <w:left w:val="single" w:sz="4" w:space="4" w:color="auto"/>
+          <w:bottom w:val="single" w:sz="4" w:space="1" w:color="auto"/>
+          <w:right w:val="single" w:sz="4" w:space="4" w:color="auto"/>
+        </w:pBdr>
+        <w:rPr>
+          <w:lang w:val="en-US"/>
+        </w:rPr>
+      </w:pPr>
+      <w:r>
+        <w:rPr>
+          <w:lang w:val="en-US"/>
+        </w:rPr>
+        <w:t>If CTRL+SHIFT+P does not show up the command selection dropdown at the top in VSC, do not worry.</w:t>
+      </w:r>
+    </w:p>
+    <w:p>
+      <w:pPr>
+        <w:pStyle w:val="ListParagraph"/>
+        <w:numPr>
+          <w:ilvl w:val="0"/>
+          <w:numId w:val="11"/>
+        </w:numPr>
+        <w:pBdr>
+          <w:top w:val="single" w:sz="4" w:space="1" w:color="auto"/>
+          <w:left w:val="single" w:sz="4" w:space="4" w:color="auto"/>
+          <w:bottom w:val="single" w:sz="4" w:space="1" w:color="auto"/>
+          <w:right w:val="single" w:sz="4" w:space="4" w:color="auto"/>
+        </w:pBdr>
+        <w:rPr>
+          <w:lang w:val="en-US"/>
+        </w:rPr>
+      </w:pPr>
+      <w:r>
+        <w:rPr>
+          <w:lang w:val="en-US"/>
+        </w:rPr>
+        <w:t>Your python commands will still work.</w:t>
+      </w:r>
+    </w:p>
+    <w:p>
+      <w:pPr>
+        <w:rPr>
+          <w:lang w:val="en-US"/>
+        </w:rPr>
+      </w:pPr>
+    </w:p>
+    <w:p>
+      <w:pPr>
+        <w:pStyle w:val="Heading1"/>
+        <w:rPr>
+          <w:lang w:val="en-US"/>
+        </w:rPr>
+      </w:pPr>
+      <w:bookmarkStart w:id="8" w:name="_Toc228192868"/>
+      <w:r>
+        <w:rPr>
+          <w:lang w:val="en-US"/>
+        </w:rPr>
+        <w:lastRenderedPageBreak/>
+        <w:t>Running Python code files</w:t>
+      </w:r>
+      <w:bookmarkEnd w:id="8"/>
+    </w:p>
+    <w:p>
+      <w:pPr>
+        <w:rPr>
+          <w:lang w:val="en-US"/>
+        </w:rPr>
+      </w:pPr>
+      <w:r>
+        <w:rPr>
+          <w:lang w:val="en-US"/>
+        </w:rPr>
+        <w:t>To run the python code files, do this:</w:t>
+      </w:r>
+    </w:p>
+    <w:p>
+      <w:pPr>
+        <w:pStyle w:val="ListParagraph"/>
+        <w:numPr>
+          <w:ilvl w:val="0"/>
+          <w:numId w:val="13"/>
+        </w:numPr>
+        <w:rPr>
+          <w:lang w:val="en-US"/>
+        </w:rPr>
+      </w:pPr>
+      <w:r>
+        <w:rPr>
+          <w:lang w:val="en-US"/>
+        </w:rPr>
+        <w:t>Open your project folder in VSC</w:t>
+      </w:r>
+    </w:p>
+    <w:p>
+      <w:pPr>
+        <w:pStyle w:val="ListParagraph"/>
+        <w:numPr>
+          <w:ilvl w:val="0"/>
+          <w:numId w:val="13"/>
+        </w:numPr>
+        <w:rPr>
+          <w:lang w:val="en-US"/>
+        </w:rPr>
+      </w:pPr>
+      <w:r>
+        <w:rPr>
+          <w:lang w:val="en-US"/>
+        </w:rPr>
+        <w:t xml:space="preserve">Click on </w:t>
+      </w:r>
+      <w:r>
+        <w:rPr>
+          <w:rFonts w:ascii="Cascadia Code" w:hAnsi="Cascadia Code" w:cs="Cascadia Code"/>
+          <w:lang w:val="en-US"/>
+        </w:rPr>
+        <w:t>View -&gt; Terminal</w:t>
+      </w:r>
+      <w:r>
+        <w:rPr>
+          <w:lang w:val="en-US"/>
+        </w:rPr>
+        <w:t xml:space="preserve"> to open the terminal window or press </w:t>
+      </w:r>
+      <w:r>
+        <w:rPr>
+          <w:rFonts w:ascii="Cascadia Code" w:hAnsi="Cascadia Code" w:cs="Cascadia Code"/>
+          <w:lang w:val="en-US"/>
+        </w:rPr>
+        <w:t>CTRL+`</w:t>
+      </w:r>
+      <w:r>
+        <w:rPr>
+          <w:lang w:val="en-US"/>
+        </w:rPr>
+        <w:t>.</w:t>
+      </w:r>
+    </w:p>
+    <w:p>
+      <w:pPr>
+        <w:pStyle w:val="ListParagraph"/>
+        <w:numPr>
+          <w:ilvl w:val="0"/>
+          <w:numId w:val="13"/>
+        </w:numPr>
+        <w:rPr>
+          <w:lang w:val="en-US"/>
+        </w:rPr>
+      </w:pPr>
+      <w:r>
+        <w:rPr>
+          <w:lang w:val="en-US"/>
+        </w:rPr>
+        <w:t>Make sure you are in the right folder of your project in the terminal window</w:t>
+      </w:r>
+    </w:p>
+    <w:p>
+      <w:pPr>
+        <w:pStyle w:val="ListParagraph"/>
+        <w:numPr>
+          <w:ilvl w:val="0"/>
+          <w:numId w:val="13"/>
+        </w:numPr>
+        <w:rPr>
+          <w:lang w:val="en-US"/>
+        </w:rPr>
+      </w:pPr>
+      <w:r>
+        <w:rPr>
+          <w:lang w:val="en-US"/>
+        </w:rPr>
+        <w:t xml:space="preserve">Every sub-folder in the project will have it’s own specific </w:t>
+      </w:r>
+      <w:r>
+        <w:rPr>
+          <w:rFonts w:ascii="Cascadia Code" w:hAnsi="Cascadia Code" w:cs="Cascadia Code"/>
+          <w:lang w:val="en-US"/>
+        </w:rPr>
+        <w:t>install.txt</w:t>
+      </w:r>
+      <w:r>
+        <w:rPr>
+          <w:lang w:val="en-US"/>
+        </w:rPr>
+        <w:t xml:space="preserve"> file that has the commands to install the packages required to run the code in that folder.</w:t>
+      </w:r>
+    </w:p>
+    <w:p>
+      <w:pPr>
+        <w:pStyle w:val="ListParagraph"/>
+        <w:numPr>
+          <w:ilvl w:val="0"/>
+          <w:numId w:val="13"/>
+        </w:numPr>
+        <w:rPr>
+          <w:lang w:val="en-US"/>
+        </w:rPr>
+      </w:pPr>
+      <w:r>
+        <w:rPr>
+          <w:lang w:val="en-US"/>
+        </w:rPr>
+        <w:t xml:space="preserve">Navigate to the sub-folder and open the </w:t>
+      </w:r>
+      <w:r>
+        <w:rPr>
+          <w:rFonts w:ascii="Cascadia Code" w:hAnsi="Cascadia Code" w:cs="Cascadia Code"/>
+          <w:lang w:val="en-US"/>
+        </w:rPr>
+        <w:t>installs.txt</w:t>
+      </w:r>
+      <w:r>
+        <w:rPr>
+          <w:lang w:val="en-US"/>
+        </w:rPr>
+        <w:t xml:space="preserve"> file.</w:t>
+      </w:r>
+    </w:p>
+    <w:p>
+      <w:pPr>
+        <w:pStyle w:val="ListParagraph"/>
+        <w:numPr>
+          <w:ilvl w:val="0"/>
+          <w:numId w:val="13"/>
+        </w:numPr>
+        <w:rPr>
+          <w:lang w:val="en-US"/>
+        </w:rPr>
+      </w:pPr>
+      <w:r>
+        <w:rPr>
+          <w:lang w:val="en-US"/>
+        </w:rPr>
+        <w:t>In the terminal windows, navigate to the folder. For e.g.;</w:t>
       </w:r>
     </w:p>
     <w:p>
@@ -1881,14 +3043,105 @@
         </w:pBdr>
         <w:spacing w:after="0" w:line="240" w:lineRule="auto"/>
         <w:rPr>
+          <w:rFonts w:ascii="Cascadia Code" w:hAnsi="Cascadia Code"/>
+          <w:lang w:val="en-US"/>
+        </w:rPr>
+      </w:pPr>
+      <w:r>
+        <w:rPr>
+          <w:rFonts w:ascii="Cascadia Code" w:hAnsi="Cascadia Code"/>
+          <w:lang w:val="en-US"/>
+        </w:rPr>
+        <w:t xml:space="preserve">cd </w:t>
+      </w:r>
+      <w:r>
+        <w:rPr>
+          <w:rFonts w:ascii="Cascadia Code" w:hAnsi="Cascadia Code"/>
+          <w:lang w:val="en-US"/>
+        </w:rPr>
+        <w:t>demo01_tokens</w:t>
+      </w:r>
+      <w:r>
+        <w:rPr>
+          <w:rFonts w:ascii="Cascadia Code" w:hAnsi="Cascadia Code"/>
+          <w:lang w:val="en-US"/>
+        </w:rPr>
+        <w:t xml:space="preserve"> </w:t>
+      </w:r>
+    </w:p>
+    <w:p>
+      <w:pPr>
+        <w:pStyle w:val="ListParagraph"/>
+        <w:numPr>
+          <w:ilvl w:val="0"/>
+          <w:numId w:val="13"/>
+        </w:numPr>
+        <w:rPr>
+          <w:lang w:val="en-US"/>
+        </w:rPr>
+      </w:pPr>
+      <w:r>
+        <w:rPr>
+          <w:lang w:val="en-US"/>
+        </w:rPr>
+        <w:t xml:space="preserve">Copy the </w:t>
+      </w:r>
+      <w:r>
+        <w:rPr>
           <w:rFonts w:ascii="Cascadia Code" w:hAnsi="Cascadia Code" w:cs="Cascadia Code"/>
-        </w:rPr>
-      </w:pPr>
+          <w:lang w:val="en-US"/>
+        </w:rPr>
+        <w:t>pip install</w:t>
+      </w:r>
+      <w:r>
+        <w:rPr>
+          <w:lang w:val="en-US"/>
+        </w:rPr>
+        <w:t xml:space="preserve"> commands from the file and run them one after the other in the terminal window.</w:t>
+      </w:r>
+    </w:p>
+    <w:p>
+      <w:pPr>
+        <w:pStyle w:val="ListParagraph"/>
+        <w:numPr>
+          <w:ilvl w:val="0"/>
+          <w:numId w:val="13"/>
+        </w:numPr>
+        <w:rPr>
+          <w:lang w:val="en-US"/>
+        </w:rPr>
+      </w:pPr>
+      <w:r>
+        <w:rPr>
+          <w:lang w:val="en-US"/>
+        </w:rPr>
+        <w:t xml:space="preserve">For e.g.; for the code for day #1, in the </w:t>
+      </w:r>
       <w:r>
         <w:rPr>
           <w:rFonts w:ascii="Cascadia Code" w:hAnsi="Cascadia Code" w:cs="Cascadia Code"/>
-        </w:rPr>
-        <w:t>AZURE_OPENAI_API_KEY="&lt;YOUR AZURE_OPENAI_API_KEY&gt;"</w:t>
+          <w:lang w:val="en-US"/>
+        </w:rPr>
+        <w:t>demo01_tokens</w:t>
+      </w:r>
+      <w:r>
+        <w:rPr>
+          <w:lang w:val="en-US"/>
+        </w:rPr>
+        <w:t xml:space="preserve"> folder, the </w:t>
+      </w:r>
+      <w:r>
+        <w:rPr>
+          <w:rFonts w:ascii="Cascadia Code" w:hAnsi="Cascadia Code" w:cs="Cascadia Code"/>
+          <w:lang w:val="en-US"/>
+        </w:rPr>
+        <w:t>installs.txt</w:t>
+      </w:r>
+      <w:r>
+        <w:rPr>
+          <w:lang w:val="en-US"/>
+        </w:rPr>
+        <w:t xml:space="preserve"> file has these commands:</w:t>
       </w:r>
     </w:p>
     <w:p>
@@ -1901,14 +3154,16 @@
         </w:pBdr>
         <w:spacing w:after="0" w:line="240" w:lineRule="auto"/>
         <w:rPr>
-          <w:rFonts w:ascii="Cascadia Code" w:hAnsi="Cascadia Code" w:cs="Cascadia Code"/>
-        </w:rPr>
-      </w:pPr>
-      <w:r>
-        <w:rPr>
-          <w:rFonts w:ascii="Cascadia Code" w:hAnsi="Cascadia Code" w:cs="Cascadia Code"/>
-        </w:rPr>
-        <w:t>AZURE_OPENAI_ENDPOINT="&lt;YOUR AZURE_OPENAI_ENDPOINT&gt;"</w:t>
+          <w:rFonts w:ascii="Cascadia Code" w:hAnsi="Cascadia Code"/>
+          <w:lang w:val="en-US"/>
+        </w:rPr>
+      </w:pPr>
+      <w:r>
+        <w:rPr>
+          <w:rFonts w:ascii="Cascadia Code" w:hAnsi="Cascadia Code"/>
+          <w:lang w:val="en-US"/>
+        </w:rPr>
+        <w:t>pip install openai numpy matplotlib seaborn tiktoken</w:t>
       </w:r>
     </w:p>
     <w:p>
@@ -1921,15 +3176,175 @@
         </w:pBdr>
         <w:spacing w:after="0" w:line="240" w:lineRule="auto"/>
         <w:rPr>
+          <w:rFonts w:ascii="Cascadia Code" w:hAnsi="Cascadia Code"/>
+          <w:lang w:val="en-US"/>
+        </w:rPr>
+      </w:pPr>
+      <w:r>
+        <w:rPr>
+          <w:rFonts w:ascii="Cascadia Code" w:hAnsi="Cascadia Code"/>
+          <w:lang w:val="en-US"/>
+        </w:rPr>
+        <w:t>pip install python-dotenv</w:t>
+      </w:r>
+    </w:p>
+    <w:p>
+      <w:pPr>
+        <w:pStyle w:val="ListParagraph"/>
+        <w:numPr>
+          <w:ilvl w:val="0"/>
+          <w:numId w:val="13"/>
+        </w:numPr>
+        <w:rPr>
+          <w:lang w:val="en-US"/>
+        </w:rPr>
+      </w:pPr>
+      <w:r>
+        <w:rPr>
+          <w:lang w:val="en-US"/>
+        </w:rPr>
+        <w:t>Copy the first command and paste it in the terminal window and run it.</w:t>
+      </w:r>
+    </w:p>
+    <w:p>
+      <w:pPr>
+        <w:pStyle w:val="ListParagraph"/>
+        <w:numPr>
+          <w:ilvl w:val="0"/>
+          <w:numId w:val="13"/>
+        </w:numPr>
+        <w:rPr>
+          <w:lang w:val="en-US"/>
+        </w:rPr>
+      </w:pPr>
+      <w:r>
+        <w:rPr>
+          <w:lang w:val="en-US"/>
+        </w:rPr>
+        <w:t>Then do the same for the second command.</w:t>
+      </w:r>
+    </w:p>
+    <w:p>
+      <w:pPr>
+        <w:pStyle w:val="ListParagraph"/>
+        <w:numPr>
+          <w:ilvl w:val="0"/>
+          <w:numId w:val="13"/>
+        </w:numPr>
+        <w:rPr>
+          <w:lang w:val="en-US"/>
+        </w:rPr>
+      </w:pPr>
+      <w:r>
+        <w:rPr>
+          <w:lang w:val="en-US"/>
+        </w:rPr>
+        <w:t xml:space="preserve">Execute all such </w:t>
+      </w:r>
+      <w:r>
+        <w:rPr>
           <w:rFonts w:ascii="Cascadia Code" w:hAnsi="Cascadia Code" w:cs="Cascadia Code"/>
-        </w:rPr>
-      </w:pPr>
+          <w:lang w:val="en-US"/>
+        </w:rPr>
+        <w:t>pip install</w:t>
+      </w:r>
+      <w:r>
+        <w:rPr>
+          <w:lang w:val="en-US"/>
+        </w:rPr>
+        <w:t xml:space="preserve"> commands in the file.</w:t>
+      </w:r>
+    </w:p>
+    <w:p>
+      <w:pPr>
+        <w:pStyle w:val="ListParagraph"/>
+        <w:numPr>
+          <w:ilvl w:val="0"/>
+          <w:numId w:val="13"/>
+        </w:numPr>
+        <w:rPr>
+          <w:lang w:val="en-US"/>
+        </w:rPr>
+      </w:pPr>
+      <w:r>
+        <w:rPr>
+          <w:lang w:val="en-US"/>
+        </w:rPr>
+        <w:t xml:space="preserve">Once done, you can run the </w:t>
+      </w:r>
       <w:r>
         <w:rPr>
           <w:rFonts w:ascii="Cascadia Code" w:hAnsi="Cascadia Code" w:cs="Cascadia Code"/>
-        </w:rPr>
-        <w:lastRenderedPageBreak/>
-        <w:t>AZURE_OPENAI_DEPLOYMENT=gpt-4o-mini</w:t>
+          <w:lang w:val="en-US"/>
+        </w:rPr>
+        <w:t>.py</w:t>
+      </w:r>
+      <w:r>
+        <w:rPr>
+          <w:lang w:val="en-US"/>
+        </w:rPr>
+        <w:t xml:space="preserve"> file in that folder.</w:t>
+      </w:r>
+    </w:p>
+    <w:p>
+      <w:pPr>
+        <w:pStyle w:val="ListParagraph"/>
+        <w:numPr>
+          <w:ilvl w:val="0"/>
+          <w:numId w:val="13"/>
+        </w:numPr>
+        <w:rPr>
+          <w:lang w:val="en-US"/>
+        </w:rPr>
+      </w:pPr>
+      <w:r>
+        <w:rPr>
+          <w:lang w:val="en-US"/>
+        </w:rPr>
+        <w:t>In the terminal windows, make sure you are in the right folder</w:t>
+      </w:r>
+    </w:p>
+    <w:p>
+      <w:pPr>
+        <w:pStyle w:val="ListParagraph"/>
+        <w:numPr>
+          <w:ilvl w:val="0"/>
+          <w:numId w:val="13"/>
+        </w:numPr>
+        <w:rPr>
+          <w:lang w:val="en-US"/>
+        </w:rPr>
+      </w:pPr>
+      <w:r>
+        <w:rPr>
+          <w:lang w:val="en-US"/>
+        </w:rPr>
+        <w:t xml:space="preserve">Then run the </w:t>
+      </w:r>
+      <w:r>
+        <w:rPr>
+          <w:rFonts w:ascii="Cascadia Code" w:hAnsi="Cascadia Code" w:cs="Cascadia Code"/>
+          <w:lang w:val="en-US"/>
+        </w:rPr>
+        <w:t>.py</w:t>
+      </w:r>
+      <w:r>
+        <w:rPr>
+          <w:lang w:val="en-US"/>
+        </w:rPr>
+        <w:t xml:space="preserve"> file</w:t>
+      </w:r>
+      <w:r>
+        <w:rPr>
+          <w:lang w:val="en-US"/>
+        </w:rPr>
+        <w:t>. For e.g.;</w:t>
+      </w:r>
+      <w:r>
+        <w:rPr>
+          <w:lang w:val="en-US"/>
+        </w:rPr>
+        <w:t>:</w:t>
       </w:r>
     </w:p>
     <w:p>
@@ -1942,49 +3357,38 @@
         </w:pBdr>
         <w:spacing w:after="0" w:line="240" w:lineRule="auto"/>
         <w:rPr>
-          <w:rFonts w:ascii="Cascadia Code" w:hAnsi="Cascadia Code" w:cs="Cascadia Code"/>
-        </w:rPr>
-      </w:pPr>
-      <w:r>
-        <w:rPr>
-          <w:rFonts w:ascii="Cascadia Code" w:hAnsi="Cascadia Code" w:cs="Cascadia Code"/>
-        </w:rPr>
-        <w:t>AZURE_OPENAI_API_VERSION=2024-02-15-preview</w:t>
-      </w:r>
-    </w:p>
-    <w:p>
-      <w:pPr>
-        <w:pBdr>
-          <w:top w:val="single" w:sz="4" w:space="1" w:color="auto"/>
-          <w:left w:val="single" w:sz="4" w:space="4" w:color="auto"/>
-          <w:bottom w:val="single" w:sz="4" w:space="1" w:color="auto"/>
-          <w:right w:val="single" w:sz="4" w:space="4" w:color="auto"/>
-        </w:pBdr>
-        <w:spacing w:after="0" w:line="240" w:lineRule="auto"/>
-        <w:rPr>
-          <w:rFonts w:ascii="Cascadia Code" w:hAnsi="Cascadia Code" w:cs="Cascadia Code"/>
-        </w:rPr>
-      </w:pPr>
-      <w:r>
-        <w:rPr>
-          <w:rFonts w:ascii="Cascadia Code" w:hAnsi="Cascadia Code" w:cs="Cascadia Code"/>
-        </w:rPr>
-        <w:t>AZURE_OPENAI_EMBEDDING_DEPLOYMENT=text-embedding-3-small</w:t>
-      </w:r>
-    </w:p>
-    <w:p>
-      <w:pPr>
-        <w:rPr>
-          <w:lang w:val="en-US"/>
-        </w:rPr>
-      </w:pPr>
+          <w:rFonts w:ascii="Cascadia Code" w:hAnsi="Cascadia Code"/>
+          <w:lang w:val="en-US"/>
+        </w:rPr>
+      </w:pPr>
+      <w:r>
+        <w:rPr>
+          <w:rFonts w:ascii="Cascadia Code" w:hAnsi="Cascadia Code"/>
+          <w:lang w:val="en-US"/>
+        </w:rPr>
+        <w:t xml:space="preserve">python </w:t>
+      </w:r>
+      <w:r>
+        <w:rPr>
+          <w:rFonts w:ascii="Cascadia Code" w:hAnsi="Cascadia Code"/>
+          <w:lang w:val="en-US"/>
+        </w:rPr>
+        <w:t>demo01_token</w:t>
+      </w:r>
+      <w:r>
+        <w:rPr>
+          <w:rFonts w:ascii="Cascadia Code" w:hAnsi="Cascadia Code"/>
+          <w:lang w:val="en-US"/>
+        </w:rPr>
+        <w:t>_visual.py</w:t>
+      </w:r>
     </w:p>
     <w:p>
       <w:pPr>
         <w:pStyle w:val="ListParagraph"/>
         <w:numPr>
           <w:ilvl w:val="0"/>
-          <w:numId w:val="11"/>
+          <w:numId w:val="13"/>
         </w:numPr>
         <w:rPr>
           <w:lang w:val="en-US"/>
@@ -1994,74 +3398,34 @@
         <w:rPr>
           <w:lang w:val="en-US"/>
         </w:rPr>
-        <w:t>Replace</w:t>
-      </w:r>
-      <w:r>
-        <w:rPr>
-          <w:lang w:val="en-US"/>
-        </w:rPr>
-        <w:t xml:space="preserve"> </w:t>
-      </w:r>
-      <w:r>
-        <w:rPr>
-          <w:rFonts w:ascii="Cascadia Code" w:hAnsi="Cascadia Code" w:cs="Cascadia Code"/>
-        </w:rPr>
-        <w:t>="&lt;YOUR AZURE_OPENAI_API_KEY&gt;</w:t>
-      </w:r>
-      <w:r>
-        <w:rPr>
-          <w:lang w:val="en-US"/>
-        </w:rPr>
-        <w:t xml:space="preserve"> with the Key you copied from your Azure OpenAI resource.</w:t>
-      </w:r>
-    </w:p>
-    <w:p>
-      <w:pPr>
-        <w:pStyle w:val="ListParagraph"/>
-        <w:numPr>
-          <w:ilvl w:val="0"/>
-          <w:numId w:val="11"/>
-        </w:numPr>
-        <w:rPr>
-          <w:lang w:val="en-US"/>
-        </w:rPr>
-      </w:pPr>
-      <w:r>
-        <w:rPr>
-          <w:lang w:val="en-US"/>
-        </w:rPr>
-        <w:t>Replace</w:t>
-      </w:r>
-      <w:r>
-        <w:rPr>
-          <w:lang w:val="en-US"/>
-        </w:rPr>
-        <w:t xml:space="preserve"> </w:t>
-      </w:r>
-      <w:r>
-        <w:rPr>
-          <w:rFonts w:ascii="Cascadia Code" w:hAnsi="Cascadia Code" w:cs="Cascadia Code"/>
-        </w:rPr>
-        <w:t>&lt;YOUR AZURE_OPENAI_ENDPOINT&gt;"</w:t>
-      </w:r>
-      <w:r>
-        <w:rPr>
-          <w:lang w:val="en-US"/>
-        </w:rPr>
-        <w:t xml:space="preserve"> with the </w:t>
-      </w:r>
-      <w:r>
-        <w:rPr>
-          <w:lang w:val="en-US"/>
-        </w:rPr>
-        <w:t xml:space="preserve">endpoint value </w:t>
-      </w:r>
-      <w:r>
-        <w:rPr>
-          <w:lang w:val="en-US"/>
-        </w:rPr>
-        <w:t>you copied from your Azure OpenAI resource.</w:t>
-      </w:r>
+        <w:t>It will show the output from the code</w:t>
+      </w:r>
+      <w:r>
+        <w:rPr>
+          <w:lang w:val="en-US"/>
+        </w:rPr>
+        <w:t xml:space="preserve"> execution</w:t>
+      </w:r>
+      <w:r>
+        <w:rPr>
+          <w:lang w:val="en-US"/>
+        </w:rPr>
+        <w:t>.</w:t>
+      </w:r>
+    </w:p>
+    <w:p>
+      <w:pPr>
+        <w:rPr>
+          <w:lang w:val="en-US"/>
+        </w:rPr>
+      </w:pPr>
+    </w:p>
+    <w:p>
+      <w:pPr>
+        <w:rPr>
+          <w:lang w:val="en-US"/>
+        </w:rPr>
+      </w:pPr>
     </w:p>
     <w:p>
       <w:pPr>
@@ -2071,8 +3435,8 @@
       </w:pPr>
     </w:p>
     <w:sectPr>
-      <w:headerReference w:type="default" r:id="rId9"/>
-      <w:footerReference w:type="default" r:id="rId10"/>
+      <w:headerReference w:type="default" r:id="rId11"/>
+      <w:footerReference w:type="default" r:id="rId12"/>
       <w:pgSz w:w="11906" w:h="16838"/>
       <w:pgMar w:top="1440" w:right="1440" w:bottom="1440" w:left="1440" w:header="708" w:footer="708" w:gutter="0"/>
       <w:cols w:space="708"/>
@@ -2466,6 +3830,119 @@
     </w:lvl>
   </w:abstractNum>
   <w:abstractNum w:abstractNumId="1" w15:restartNumberingAfterBreak="0">
+    <w:nsid w:val="0A65005D"/>
+    <w:multiLevelType w:val="hybridMultilevel"/>
+    <w:tmpl w:val="2E62DB90"/>
+    <w:lvl w:ilvl="0" w:tplc="40090001">
+      <w:start w:val="1"/>
+      <w:numFmt w:val="bullet"/>
+      <w:lvlText w:val=""/>
+      <w:lvlJc w:val="left"/>
+      <w:pPr>
+        <w:ind w:left="720" w:hanging="360"/>
+      </w:pPr>
+      <w:rPr>
+        <w:rFonts w:ascii="Symbol" w:hAnsi="Symbol" w:hint="default"/>
+      </w:rPr>
+    </w:lvl>
+    <w:lvl w:ilvl="1" w:tplc="40090003">
+      <w:start w:val="1"/>
+      <w:numFmt w:val="bullet"/>
+      <w:lvlText w:val="o"/>
+      <w:lvlJc w:val="left"/>
+      <w:pPr>
+        <w:ind w:left="1440" w:hanging="360"/>
+      </w:pPr>
+      <w:rPr>
+        <w:rFonts w:ascii="Courier New" w:hAnsi="Courier New" w:cs="Courier New" w:hint="default"/>
+      </w:rPr>
+    </w:lvl>
+    <w:lvl w:ilvl="2" w:tplc="40090005" w:tentative="1">
+      <w:start w:val="1"/>
+      <w:numFmt w:val="bullet"/>
+      <w:lvlText w:val=""/>
+      <w:lvlJc w:val="left"/>
+      <w:pPr>
+        <w:ind w:left="2160" w:hanging="360"/>
+      </w:pPr>
+      <w:rPr>
+        <w:rFonts w:ascii="Wingdings" w:hAnsi="Wingdings" w:hint="default"/>
+      </w:rPr>
+    </w:lvl>
+    <w:lvl w:ilvl="3" w:tplc="40090001" w:tentative="1">
+      <w:start w:val="1"/>
+      <w:numFmt w:val="bullet"/>
+      <w:lvlText w:val=""/>
+      <w:lvlJc w:val="left"/>
+      <w:pPr>
+        <w:ind w:left="2880" w:hanging="360"/>
+      </w:pPr>
+      <w:rPr>
+        <w:rFonts w:ascii="Symbol" w:hAnsi="Symbol" w:hint="default"/>
+      </w:rPr>
+    </w:lvl>
+    <w:lvl w:ilvl="4" w:tplc="40090003" w:tentative="1">
+      <w:start w:val="1"/>
+      <w:numFmt w:val="bullet"/>
+      <w:lvlText w:val="o"/>
+      <w:lvlJc w:val="left"/>
+      <w:pPr>
+        <w:ind w:left="3600" w:hanging="360"/>
+      </w:pPr>
+      <w:rPr>
+        <w:rFonts w:ascii="Courier New" w:hAnsi="Courier New" w:cs="Courier New" w:hint="default"/>
+      </w:rPr>
+    </w:lvl>
+    <w:lvl w:ilvl="5" w:tplc="40090005" w:tentative="1">
+      <w:start w:val="1"/>
+      <w:numFmt w:val="bullet"/>
+      <w:lvlText w:val=""/>
+      <w:lvlJc w:val="left"/>
+      <w:pPr>
+        <w:ind w:left="4320" w:hanging="360"/>
+      </w:pPr>
+      <w:rPr>
+        <w:rFonts w:ascii="Wingdings" w:hAnsi="Wingdings" w:hint="default"/>
+      </w:rPr>
+    </w:lvl>
+    <w:lvl w:ilvl="6" w:tplc="40090001" w:tentative="1">
+      <w:start w:val="1"/>
+      <w:numFmt w:val="bullet"/>
+      <w:lvlText w:val=""/>
+      <w:lvlJc w:val="left"/>
+      <w:pPr>
+        <w:ind w:left="5040" w:hanging="360"/>
+      </w:pPr>
+      <w:rPr>
+        <w:rFonts w:ascii="Symbol" w:hAnsi="Symbol" w:hint="default"/>
+      </w:rPr>
+    </w:lvl>
+    <w:lvl w:ilvl="7" w:tplc="40090003" w:tentative="1">
+      <w:start w:val="1"/>
+      <w:numFmt w:val="bullet"/>
+      <w:lvlText w:val="o"/>
+      <w:lvlJc w:val="left"/>
+      <w:pPr>
+        <w:ind w:left="5760" w:hanging="360"/>
+      </w:pPr>
+      <w:rPr>
+        <w:rFonts w:ascii="Courier New" w:hAnsi="Courier New" w:cs="Courier New" w:hint="default"/>
+      </w:rPr>
+    </w:lvl>
+    <w:lvl w:ilvl="8" w:tplc="40090005" w:tentative="1">
+      <w:start w:val="1"/>
+      <w:numFmt w:val="bullet"/>
+      <w:lvlText w:val=""/>
+      <w:lvlJc w:val="left"/>
+      <w:pPr>
+        <w:ind w:left="6480" w:hanging="360"/>
+      </w:pPr>
+      <w:rPr>
+        <w:rFonts w:ascii="Wingdings" w:hAnsi="Wingdings" w:hint="default"/>
+      </w:rPr>
+    </w:lvl>
+  </w:abstractNum>
+  <w:abstractNum w:abstractNumId="2" w15:restartNumberingAfterBreak="0">
     <w:nsid w:val="0B1C538A"/>
     <w:multiLevelType w:val="hybridMultilevel"/>
     <w:tmpl w:val="230848F8"/>
@@ -2578,7 +4055,7 @@
       </w:rPr>
     </w:lvl>
   </w:abstractNum>
-  <w:abstractNum w:abstractNumId="2" w15:restartNumberingAfterBreak="0">
+  <w:abstractNum w:abstractNumId="3" w15:restartNumberingAfterBreak="0">
     <w:nsid w:val="0BA02DE0"/>
     <w:multiLevelType w:val="hybridMultilevel"/>
     <w:tmpl w:val="4DECDBEA"/>
@@ -2691,7 +4168,7 @@
       </w:rPr>
     </w:lvl>
   </w:abstractNum>
-  <w:abstractNum w:abstractNumId="3" w15:restartNumberingAfterBreak="0">
+  <w:abstractNum w:abstractNumId="4" w15:restartNumberingAfterBreak="0">
     <w:nsid w:val="179D17FA"/>
     <w:multiLevelType w:val="hybridMultilevel"/>
     <w:tmpl w:val="00ECC238"/>
@@ -2804,7 +4281,120 @@
       </w:rPr>
     </w:lvl>
   </w:abstractNum>
-  <w:abstractNum w:abstractNumId="4" w15:restartNumberingAfterBreak="0">
+  <w:abstractNum w:abstractNumId="5" w15:restartNumberingAfterBreak="0">
+    <w:nsid w:val="207F724C"/>
+    <w:multiLevelType w:val="hybridMultilevel"/>
+    <w:tmpl w:val="4C86270E"/>
+    <w:lvl w:ilvl="0" w:tplc="40090001">
+      <w:start w:val="1"/>
+      <w:numFmt w:val="bullet"/>
+      <w:lvlText w:val=""/>
+      <w:lvlJc w:val="left"/>
+      <w:pPr>
+        <w:ind w:left="720" w:hanging="360"/>
+      </w:pPr>
+      <w:rPr>
+        <w:rFonts w:ascii="Symbol" w:hAnsi="Symbol" w:hint="default"/>
+      </w:rPr>
+    </w:lvl>
+    <w:lvl w:ilvl="1" w:tplc="40090003" w:tentative="1">
+      <w:start w:val="1"/>
+      <w:numFmt w:val="bullet"/>
+      <w:lvlText w:val="o"/>
+      <w:lvlJc w:val="left"/>
+      <w:pPr>
+        <w:ind w:left="1440" w:hanging="360"/>
+      </w:pPr>
+      <w:rPr>
+        <w:rFonts w:ascii="Courier New" w:hAnsi="Courier New" w:cs="Courier New" w:hint="default"/>
+      </w:rPr>
+    </w:lvl>
+    <w:lvl w:ilvl="2" w:tplc="40090005" w:tentative="1">
+      <w:start w:val="1"/>
+      <w:numFmt w:val="bullet"/>
+      <w:lvlText w:val=""/>
+      <w:lvlJc w:val="left"/>
+      <w:pPr>
+        <w:ind w:left="2160" w:hanging="360"/>
+      </w:pPr>
+      <w:rPr>
+        <w:rFonts w:ascii="Wingdings" w:hAnsi="Wingdings" w:hint="default"/>
+      </w:rPr>
+    </w:lvl>
+    <w:lvl w:ilvl="3" w:tplc="40090001" w:tentative="1">
+      <w:start w:val="1"/>
+      <w:numFmt w:val="bullet"/>
+      <w:lvlText w:val=""/>
+      <w:lvlJc w:val="left"/>
+      <w:pPr>
+        <w:ind w:left="2880" w:hanging="360"/>
+      </w:pPr>
+      <w:rPr>
+        <w:rFonts w:ascii="Symbol" w:hAnsi="Symbol" w:hint="default"/>
+      </w:rPr>
+    </w:lvl>
+    <w:lvl w:ilvl="4" w:tplc="40090003" w:tentative="1">
+      <w:start w:val="1"/>
+      <w:numFmt w:val="bullet"/>
+      <w:lvlText w:val="o"/>
+      <w:lvlJc w:val="left"/>
+      <w:pPr>
+        <w:ind w:left="3600" w:hanging="360"/>
+      </w:pPr>
+      <w:rPr>
+        <w:rFonts w:ascii="Courier New" w:hAnsi="Courier New" w:cs="Courier New" w:hint="default"/>
+      </w:rPr>
+    </w:lvl>
+    <w:lvl w:ilvl="5" w:tplc="40090005" w:tentative="1">
+      <w:start w:val="1"/>
+      <w:numFmt w:val="bullet"/>
+      <w:lvlText w:val=""/>
+      <w:lvlJc w:val="left"/>
+      <w:pPr>
+        <w:ind w:left="4320" w:hanging="360"/>
+      </w:pPr>
+      <w:rPr>
+        <w:rFonts w:ascii="Wingdings" w:hAnsi="Wingdings" w:hint="default"/>
+      </w:rPr>
+    </w:lvl>
+    <w:lvl w:ilvl="6" w:tplc="40090001" w:tentative="1">
+      <w:start w:val="1"/>
+      <w:numFmt w:val="bullet"/>
+      <w:lvlText w:val=""/>
+      <w:lvlJc w:val="left"/>
+      <w:pPr>
+        <w:ind w:left="5040" w:hanging="360"/>
+      </w:pPr>
+      <w:rPr>
+        <w:rFonts w:ascii="Symbol" w:hAnsi="Symbol" w:hint="default"/>
+      </w:rPr>
+    </w:lvl>
+    <w:lvl w:ilvl="7" w:tplc="40090003" w:tentative="1">
+      <w:start w:val="1"/>
+      <w:numFmt w:val="bullet"/>
+      <w:lvlText w:val="o"/>
+      <w:lvlJc w:val="left"/>
+      <w:pPr>
+        <w:ind w:left="5760" w:hanging="360"/>
+      </w:pPr>
+      <w:rPr>
+        <w:rFonts w:ascii="Courier New" w:hAnsi="Courier New" w:cs="Courier New" w:hint="default"/>
+      </w:rPr>
+    </w:lvl>
+    <w:lvl w:ilvl="8" w:tplc="40090005" w:tentative="1">
+      <w:start w:val="1"/>
+      <w:numFmt w:val="bullet"/>
+      <w:lvlText w:val=""/>
+      <w:lvlJc w:val="left"/>
+      <w:pPr>
+        <w:ind w:left="6480" w:hanging="360"/>
+      </w:pPr>
+      <w:rPr>
+        <w:rFonts w:ascii="Wingdings" w:hAnsi="Wingdings" w:hint="default"/>
+      </w:rPr>
+    </w:lvl>
+  </w:abstractNum>
+  <w:abstractNum w:abstractNumId="6" w15:restartNumberingAfterBreak="0">
     <w:nsid w:val="36AA5AE5"/>
     <w:multiLevelType w:val="hybridMultilevel"/>
     <w:tmpl w:val="AE4E908A"/>
@@ -2917,17 +4507,17 @@
       </w:rPr>
     </w:lvl>
   </w:abstractNum>
-  <w:abstractNum w:abstractNumId="5" w15:restartNumberingAfterBreak="0">
+  <w:abstractNum w:abstractNumId="7" w15:restartNumberingAfterBreak="0">
     <w:nsid w:val="4B9C5D23"/>
     <w:multiLevelType w:val="hybridMultilevel"/>
-    <w:tmpl w:val="A72A7664"/>
+    <w:tmpl w:val="8ACAF594"/>
     <w:lvl w:ilvl="0" w:tplc="40090001">
       <w:start w:val="1"/>
       <w:numFmt w:val="bullet"/>
       <w:lvlText w:val=""/>
       <w:lvlJc w:val="left"/>
       <w:pPr>
-        <w:ind w:left="720" w:hanging="360"/>
+        <w:ind w:left="360" w:hanging="360"/>
       </w:pPr>
       <w:rPr>
         <w:rFonts w:ascii="Symbol" w:hAnsi="Symbol" w:hint="default"/>
@@ -2939,7 +4529,7 @@
       <w:lvlText w:val="o"/>
       <w:lvlJc w:val="left"/>
       <w:pPr>
-        <w:ind w:left="1440" w:hanging="360"/>
+        <w:ind w:left="1080" w:hanging="360"/>
       </w:pPr>
       <w:rPr>
         <w:rFonts w:ascii="Courier New" w:hAnsi="Courier New" w:cs="Courier New" w:hint="default"/>
@@ -2951,7 +4541,7 @@
       <w:lvlText w:val=""/>
       <w:lvlJc w:val="left"/>
       <w:pPr>
-        <w:ind w:left="2160" w:hanging="360"/>
+        <w:ind w:left="1800" w:hanging="360"/>
       </w:pPr>
       <w:rPr>
         <w:rFonts w:ascii="Wingdings" w:hAnsi="Wingdings" w:hint="default"/>
@@ -2963,7 +4553,7 @@
       <w:lvlText w:val=""/>
       <w:lvlJc w:val="left"/>
       <w:pPr>
-        <w:ind w:left="2880" w:hanging="360"/>
+        <w:ind w:left="2520" w:hanging="360"/>
       </w:pPr>
       <w:rPr>
         <w:rFonts w:ascii="Symbol" w:hAnsi="Symbol" w:hint="default"/>
@@ -2975,7 +4565,7 @@
       <w:lvlText w:val="o"/>
       <w:lvlJc w:val="left"/>
       <w:pPr>
-        <w:ind w:left="3600" w:hanging="360"/>
+        <w:ind w:left="3240" w:hanging="360"/>
       </w:pPr>
       <w:rPr>
         <w:rFonts w:ascii="Courier New" w:hAnsi="Courier New" w:cs="Courier New" w:hint="default"/>
@@ -2987,7 +4577,7 @@
       <w:lvlText w:val=""/>
       <w:lvlJc w:val="left"/>
       <w:pPr>
-        <w:ind w:left="4320" w:hanging="360"/>
+        <w:ind w:left="3960" w:hanging="360"/>
       </w:pPr>
       <w:rPr>
         <w:rFonts w:ascii="Wingdings" w:hAnsi="Wingdings" w:hint="default"/>
@@ -2999,7 +4589,7 @@
       <w:lvlText w:val=""/>
       <w:lvlJc w:val="left"/>
       <w:pPr>
-        <w:ind w:left="5040" w:hanging="360"/>
+        <w:ind w:left="4680" w:hanging="360"/>
       </w:pPr>
       <w:rPr>
         <w:rFonts w:ascii="Symbol" w:hAnsi="Symbol" w:hint="default"/>
@@ -3011,7 +4601,7 @@
       <w:lvlText w:val="o"/>
       <w:lvlJc w:val="left"/>
       <w:pPr>
-        <w:ind w:left="5760" w:hanging="360"/>
+        <w:ind w:left="5400" w:hanging="360"/>
       </w:pPr>
       <w:rPr>
         <w:rFonts w:ascii="Courier New" w:hAnsi="Courier New" w:cs="Courier New" w:hint="default"/>
@@ -3023,14 +4613,14 @@
       <w:lvlText w:val=""/>
       <w:lvlJc w:val="left"/>
       <w:pPr>
-        <w:ind w:left="6480" w:hanging="360"/>
+        <w:ind w:left="6120" w:hanging="360"/>
       </w:pPr>
       <w:rPr>
         <w:rFonts w:ascii="Wingdings" w:hAnsi="Wingdings" w:hint="default"/>
       </w:rPr>
     </w:lvl>
   </w:abstractNum>
-  <w:abstractNum w:abstractNumId="6" w15:restartNumberingAfterBreak="0">
+  <w:abstractNum w:abstractNumId="8" w15:restartNumberingAfterBreak="0">
     <w:nsid w:val="52E60042"/>
     <w:multiLevelType w:val="hybridMultilevel"/>
     <w:tmpl w:val="35FA0D6A"/>
@@ -3143,7 +4733,7 @@
       </w:rPr>
     </w:lvl>
   </w:abstractNum>
-  <w:abstractNum w:abstractNumId="7" w15:restartNumberingAfterBreak="0">
+  <w:abstractNum w:abstractNumId="9" w15:restartNumberingAfterBreak="0">
     <w:nsid w:val="60544B29"/>
     <w:multiLevelType w:val="hybridMultilevel"/>
     <w:tmpl w:val="3E68920E"/>
@@ -3256,7 +4846,7 @@
       </w:rPr>
     </w:lvl>
   </w:abstractNum>
-  <w:abstractNum w:abstractNumId="8" w15:restartNumberingAfterBreak="0">
+  <w:abstractNum w:abstractNumId="10" w15:restartNumberingAfterBreak="0">
     <w:nsid w:val="60846034"/>
     <w:multiLevelType w:val="hybridMultilevel"/>
     <w:tmpl w:val="0F1882BC"/>
@@ -3369,7 +4959,7 @@
       </w:rPr>
     </w:lvl>
   </w:abstractNum>
-  <w:abstractNum w:abstractNumId="9" w15:restartNumberingAfterBreak="0">
+  <w:abstractNum w:abstractNumId="11" w15:restartNumberingAfterBreak="0">
     <w:nsid w:val="6A2717E4"/>
     <w:multiLevelType w:val="hybridMultilevel"/>
     <w:tmpl w:val="2964525E"/>
@@ -3482,7 +5072,7 @@
       </w:rPr>
     </w:lvl>
   </w:abstractNum>
-  <w:abstractNum w:abstractNumId="10" w15:restartNumberingAfterBreak="0">
+  <w:abstractNum w:abstractNumId="12" w15:restartNumberingAfterBreak="0">
     <w:nsid w:val="79935464"/>
     <w:multiLevelType w:val="hybridMultilevel"/>
     <w:tmpl w:val="86CA95BC"/>
@@ -3596,36 +5186,42 @@
     </w:lvl>
   </w:abstractNum>
   <w:num w:numId="1" w16cid:durableId="1238980576">
-    <w:abstractNumId w:val="10"/>
+    <w:abstractNumId w:val="12"/>
   </w:num>
   <w:num w:numId="2" w16cid:durableId="1357316654">
-    <w:abstractNumId w:val="6"/>
+    <w:abstractNumId w:val="8"/>
   </w:num>
   <w:num w:numId="3" w16cid:durableId="280472">
-    <w:abstractNumId w:val="7"/>
+    <w:abstractNumId w:val="9"/>
   </w:num>
   <w:num w:numId="4" w16cid:durableId="1329753355">
-    <w:abstractNumId w:val="2"/>
+    <w:abstractNumId w:val="3"/>
   </w:num>
   <w:num w:numId="5" w16cid:durableId="1647196370">
     <w:abstractNumId w:val="0"/>
   </w:num>
   <w:num w:numId="6" w16cid:durableId="1637251492">
-    <w:abstractNumId w:val="8"/>
+    <w:abstractNumId w:val="10"/>
   </w:num>
   <w:num w:numId="7" w16cid:durableId="492990867">
-    <w:abstractNumId w:val="9"/>
+    <w:abstractNumId w:val="11"/>
   </w:num>
   <w:num w:numId="8" w16cid:durableId="1955936274">
+    <w:abstractNumId w:val="6"/>
+  </w:num>
+  <w:num w:numId="9" w16cid:durableId="1599634520">
+    <w:abstractNumId w:val="2"/>
+  </w:num>
+  <w:num w:numId="10" w16cid:durableId="1440762304">
     <w:abstractNumId w:val="4"/>
   </w:num>
-  <w:num w:numId="9" w16cid:durableId="1599634520">
+  <w:num w:numId="11" w16cid:durableId="1580208877">
+    <w:abstractNumId w:val="7"/>
+  </w:num>
+  <w:num w:numId="12" w16cid:durableId="9182079">
     <w:abstractNumId w:val="1"/>
   </w:num>
-  <w:num w:numId="10" w16cid:durableId="1440762304">
-    <w:abstractNumId w:val="3"/>
-  </w:num>
-  <w:num w:numId="11" w16cid:durableId="1580208877">
+  <w:num w:numId="13" w16cid:durableId="258760904">
     <w:abstractNumId w:val="5"/>
   </w:num>
 </w:numbering>
@@ -4246,6 +5842,7 @@
   <w:style w:type="character" w:default="1" w:styleId="DefaultParagraphFont">
     <w:name w:val="Default Paragraph Font"/>
     <w:uiPriority w:val="1"/>
+    <w:semiHidden/>
     <w:unhideWhenUsed/>
   </w:style>
   <w:style w:type="table" w:default="1" w:styleId="TableNormal">
@@ -4843,9 +6440,11 @@
   <w:rsids>
     <w:rsidRoot w:val="00634332"/>
     <w:rsid w:val="001C370C"/>
+    <w:rsid w:val="003319A1"/>
     <w:rsid w:val="003A3438"/>
     <w:rsid w:val="005402E3"/>
     <w:rsid w:val="00634332"/>
+    <w:rsid w:val="00885A78"/>
     <w:rsid w:val="00941F56"/>
     <w:rsid w:val="00A22DCC"/>
     <w:rsid w:val="00AB69FF"/>

</xml_diff>